<commit_message>
Updated doc for GPS logo
</commit_message>
<xml_diff>
--- a/Misc documents  and software/GPS safecast logo print  info 23x23mm.docx
+++ b/Misc documents  and software/GPS safecast logo print  info 23x23mm.docx
@@ -11,10 +11,55 @@
       </w:pPr>
       <w:r>
         <w:rPr/>
+        <w:drawing>
+          <wp:anchor behindDoc="1" distT="0" distB="0" distL="0" distR="0" simplePos="0" locked="0" layoutInCell="1" allowOverlap="1" relativeHeight="2">
+            <wp:simplePos x="0" y="0"/>
+            <wp:positionH relativeFrom="column">
+              <wp:posOffset>67310</wp:posOffset>
+            </wp:positionH>
+            <wp:positionV relativeFrom="paragraph">
+              <wp:posOffset>85090</wp:posOffset>
+            </wp:positionV>
+            <wp:extent cx="708660" cy="662305"/>
+            <wp:effectExtent l="0" t="0" r="0" b="0"/>
+            <wp:wrapNone/>
+            <wp:docPr id="1" name="Image1 Copy 1" descr=""/>
+            <wp:cNvGraphicFramePr>
+              <a:graphicFrameLocks xmlns:a="http://schemas.openxmlformats.org/drawingml/2006/main" noChangeAspect="1"/>
+            </wp:cNvGraphicFramePr>
+            <a:graphic xmlns:a="http://schemas.openxmlformats.org/drawingml/2006/main">
+              <a:graphicData uri="http://schemas.openxmlformats.org/drawingml/2006/picture">
+                <pic:pic xmlns:pic="http://schemas.openxmlformats.org/drawingml/2006/picture">
+                  <pic:nvPicPr>
+                    <pic:cNvPr id="1" name="Image1 Copy 1" descr=""/>
+                    <pic:cNvPicPr>
+                      <a:picLocks noChangeAspect="1" noChangeArrowheads="1"/>
+                    </pic:cNvPicPr>
+                  </pic:nvPicPr>
+                  <pic:blipFill>
+                    <a:blip r:embed="rId2"/>
+                    <a:stretch>
+                      <a:fillRect/>
+                    </a:stretch>
+                  </pic:blipFill>
+                  <pic:spPr bwMode="auto">
+                    <a:xfrm>
+                      <a:off x="0" y="0"/>
+                      <a:ext cx="708660" cy="662305"/>
+                    </a:xfrm>
+                    <a:prstGeom prst="rect">
+                      <a:avLst/>
+                    </a:prstGeom>
+                  </pic:spPr>
+                </pic:pic>
+              </a:graphicData>
+            </a:graphic>
+          </wp:anchor>
+        </w:drawing>
         <mc:AlternateContent>
           <mc:Choice Requires="wps">
             <w:drawing>
-              <wp:anchor behindDoc="0" distT="0" distB="0" distL="0" distR="0" simplePos="0" locked="0" layoutInCell="1" allowOverlap="1" relativeHeight="3">
+              <wp:anchor behindDoc="0" distT="635" distB="1270" distL="635" distR="1270" simplePos="0" locked="0" layoutInCell="1" allowOverlap="1" relativeHeight="3">
                 <wp:simplePos x="0" y="0"/>
                 <wp:positionH relativeFrom="column">
                   <wp:posOffset>-94615</wp:posOffset>
@@ -25,7 +70,7 @@
                 <wp:extent cx="107950" cy="107950"/>
                 <wp:effectExtent l="635" t="635" r="1270" b="1270"/>
                 <wp:wrapNone/>
-                <wp:docPr id="1" name="Shape 2"/>
+                <wp:docPr id="2" name="Shape 2"/>
                 <a:graphic xmlns:a="http://schemas.openxmlformats.org/drawingml/2006/main">
                   <a:graphicData uri="http://schemas.microsoft.com/office/word/2010/wordprocessingShape">
                     <wps:wsp>
@@ -62,8 +107,8 @@
           </mc:Choice>
           <mc:Fallback>
             <w:pict>
-              <v:oval id="shape_0" ID="Shape 2" fillcolor="white" stroked="t" o:allowincell="f" style="position:absolute;margin-left:-7.45pt;margin-top:38.3pt;width:8.45pt;height:8.45pt;mso-wrap-style:none;v-text-anchor:middle">
-                <v:fill o:detectmouseclick="t" color2="black"/>
+              <v:oval id="shape_0" ID="Shape 2" path="l-2147483648,-2147483643l-2147483628,-2147483627l-2147483648,-2147483643l-2147483626,-2147483625xe" fillcolor="white" stroked="t" o:allowincell="f" style="position:absolute;margin-left:-7.45pt;margin-top:38.3pt;width:8.45pt;height:8.45pt;mso-wrap-style:none;v-text-anchor:middle">
+                <v:fill o:detectmouseclick="t" type="solid" color2="black"/>
                 <v:stroke color="#3465a4" joinstyle="round" endcap="flat"/>
                 <w10:wrap type="none"/>
               </v:oval>
@@ -71,60 +116,15 @@
           </mc:Fallback>
         </mc:AlternateContent>
         <w:drawing>
-          <wp:anchor behindDoc="1" distT="0" distB="0" distL="0" distR="0" simplePos="0" locked="0" layoutInCell="1" allowOverlap="1" relativeHeight="2">
-            <wp:simplePos x="0" y="0"/>
-            <wp:positionH relativeFrom="column">
-              <wp:posOffset>67310</wp:posOffset>
-            </wp:positionH>
-            <wp:positionV relativeFrom="paragraph">
-              <wp:posOffset>85090</wp:posOffset>
-            </wp:positionV>
-            <wp:extent cx="708660" cy="662305"/>
-            <wp:effectExtent l="0" t="0" r="0" b="0"/>
-            <wp:wrapNone/>
-            <wp:docPr id="2" name="Image1 Copy 1" descr=""/>
-            <wp:cNvGraphicFramePr>
-              <a:graphicFrameLocks xmlns:a="http://schemas.openxmlformats.org/drawingml/2006/main" noChangeAspect="1"/>
-            </wp:cNvGraphicFramePr>
-            <a:graphic xmlns:a="http://schemas.openxmlformats.org/drawingml/2006/main">
-              <a:graphicData uri="http://schemas.openxmlformats.org/drawingml/2006/picture">
-                <pic:pic xmlns:pic="http://schemas.openxmlformats.org/drawingml/2006/picture">
-                  <pic:nvPicPr>
-                    <pic:cNvPr id="2" name="Image1 Copy 1" descr=""/>
-                    <pic:cNvPicPr>
-                      <a:picLocks noChangeAspect="1" noChangeArrowheads="1"/>
-                    </pic:cNvPicPr>
-                  </pic:nvPicPr>
-                  <pic:blipFill>
-                    <a:blip r:embed="rId2"/>
-                    <a:stretch>
-                      <a:fillRect/>
-                    </a:stretch>
-                  </pic:blipFill>
-                  <pic:spPr bwMode="auto">
-                    <a:xfrm>
-                      <a:off x="0" y="0"/>
-                      <a:ext cx="708660" cy="662305"/>
-                    </a:xfrm>
-                    <a:prstGeom prst="rect">
-                      <a:avLst/>
-                    </a:prstGeom>
-                  </pic:spPr>
-                </pic:pic>
-              </a:graphicData>
-            </a:graphic>
-          </wp:anchor>
-        </w:drawing>
-        <w:drawing>
           <wp:anchor behindDoc="0" distT="0" distB="0" distL="0" distR="0" simplePos="0" locked="0" layoutInCell="0" allowOverlap="1" relativeHeight="4">
             <wp:simplePos x="0" y="0"/>
             <wp:positionH relativeFrom="column">
-              <wp:posOffset>195580</wp:posOffset>
+              <wp:posOffset>245110</wp:posOffset>
             </wp:positionH>
             <wp:positionV relativeFrom="paragraph">
-              <wp:posOffset>161290</wp:posOffset>
+              <wp:posOffset>178435</wp:posOffset>
             </wp:positionV>
-            <wp:extent cx="435610" cy="481330"/>
+            <wp:extent cx="367030" cy="447040"/>
             <wp:effectExtent l="0" t="0" r="0" b="0"/>
             <wp:wrapSquare wrapText="largest"/>
             <wp:docPr id="3" name="Image2" descr=""/>
@@ -149,7 +149,7 @@
                   <pic:spPr bwMode="auto">
                     <a:xfrm>
                       <a:off x="0" y="0"/>
-                      <a:ext cx="435610" cy="481330"/>
+                      <a:ext cx="367030" cy="447040"/>
                     </a:xfrm>
                     <a:prstGeom prst="rect">
                       <a:avLst/>

</xml_diff>

<commit_message>
Added device ID and changed boot screen.
</commit_message>
<xml_diff>
--- a/Misc documents  and software/GPS safecast logo print  info 23x23mm.docx
+++ b/Misc documents  and software/GPS safecast logo print  info 23x23mm.docx
@@ -4,7 +4,7 @@
   <w:body>
     <w:p>
       <w:pPr>
-        <w:pStyle w:val="660"/>
+        <w:pStyle w:val="697"/>
         <w:pBdr/>
         <w:bidi w:val="false"/>
         <w:spacing/>
@@ -13,7 +13,6 @@
         <w:rPr/>
       </w:pPr>
       <w:r>
-        <w:t xml:space="preserve">:</w:t>
         <mc:AlternateContent>
           <mc:Choice Requires="wpg">
             <w:drawing>
@@ -252,7 +251,6 @@
         <w:ind/>
         <w:rPr/>
       </w:pPr>
-      <w:r/>
       <w:r>
         <w:separator/>
       </w:r>
@@ -267,7 +265,6 @@
         <w:ind/>
         <w:rPr/>
       </w:pPr>
-      <w:r/>
       <w:r>
         <w:continuationSeparator/>
       </w:r>
@@ -287,7 +284,6 @@
         <w:ind/>
         <w:rPr/>
       </w:pPr>
-      <w:r/>
       <w:r>
         <w:separator/>
       </w:r>
@@ -302,7 +298,6 @@
         <w:ind/>
         <w:rPr/>
       </w:pPr>
-      <w:r/>
       <w:r>
         <w:continuationSeparator/>
       </w:r>
@@ -470,7 +465,7 @@
     <w:lsdException w:name="Bibliography" w:uiPriority="37"/>
     <w:lsdException w:name="TOC Heading" w:uiPriority="39" w:qFormat="1"/>
   </w:latentStyles>
-  <w:style w:type="paragraph" w:styleId="660" w:default="1">
+  <w:style w:type="paragraph" w:styleId="697" w:default="1">
     <w:name w:val="Normal"/>
     <w:qFormat/>
     <w:pPr>
@@ -489,11 +484,11 @@
       <w:lang w:val="en-US" w:eastAsia="zh-CN" w:bidi="hi-IN"/>
     </w:rPr>
   </w:style>
-  <w:style w:type="paragraph" w:styleId="661">
+  <w:style w:type="paragraph" w:styleId="698">
     <w:name w:val="Heading 1"/>
-    <w:basedOn w:val="660"/>
-    <w:next w:val="660"/>
-    <w:link w:val="671"/>
+    <w:basedOn w:val="697"/>
+    <w:next w:val="697"/>
+    <w:link w:val="708"/>
     <w:uiPriority w:val="9"/>
     <w:qFormat/>
     <w:pPr>
@@ -511,11 +506,11 @@
       <w:szCs w:val="40"/>
     </w:rPr>
   </w:style>
-  <w:style w:type="paragraph" w:styleId="662">
+  <w:style w:type="paragraph" w:styleId="699">
     <w:name w:val="Heading 2"/>
-    <w:basedOn w:val="660"/>
-    <w:next w:val="660"/>
-    <w:link w:val="672"/>
+    <w:basedOn w:val="697"/>
+    <w:next w:val="697"/>
+    <w:link w:val="709"/>
     <w:uiPriority w:val="9"/>
     <w:unhideWhenUsed/>
     <w:qFormat/>
@@ -534,11 +529,11 @@
       <w:szCs w:val="32"/>
     </w:rPr>
   </w:style>
-  <w:style w:type="paragraph" w:styleId="663">
+  <w:style w:type="paragraph" w:styleId="700">
     <w:name w:val="Heading 3"/>
-    <w:basedOn w:val="660"/>
-    <w:next w:val="660"/>
-    <w:link w:val="673"/>
+    <w:basedOn w:val="697"/>
+    <w:next w:val="697"/>
+    <w:link w:val="710"/>
     <w:uiPriority w:val="9"/>
     <w:unhideWhenUsed/>
     <w:qFormat/>
@@ -557,11 +552,11 @@
       <w:szCs w:val="28"/>
     </w:rPr>
   </w:style>
-  <w:style w:type="paragraph" w:styleId="664">
+  <w:style w:type="paragraph" w:styleId="701">
     <w:name w:val="Heading 4"/>
-    <w:basedOn w:val="660"/>
-    <w:next w:val="660"/>
-    <w:link w:val="674"/>
+    <w:basedOn w:val="697"/>
+    <w:next w:val="697"/>
+    <w:link w:val="711"/>
     <w:uiPriority w:val="9"/>
     <w:unhideWhenUsed/>
     <w:qFormat/>
@@ -580,11 +575,11 @@
       <w:color w:val="0f4761" w:themeColor="accent1" w:themeShade="BF"/>
     </w:rPr>
   </w:style>
-  <w:style w:type="paragraph" w:styleId="665">
+  <w:style w:type="paragraph" w:styleId="702">
     <w:name w:val="Heading 5"/>
-    <w:basedOn w:val="660"/>
-    <w:next w:val="660"/>
-    <w:link w:val="675"/>
+    <w:basedOn w:val="697"/>
+    <w:next w:val="697"/>
+    <w:link w:val="712"/>
     <w:uiPriority w:val="9"/>
     <w:unhideWhenUsed/>
     <w:qFormat/>
@@ -601,11 +596,11 @@
       <w:color w:val="0f4761" w:themeColor="accent1" w:themeShade="BF"/>
     </w:rPr>
   </w:style>
-  <w:style w:type="paragraph" w:styleId="666">
+  <w:style w:type="paragraph" w:styleId="703">
     <w:name w:val="Heading 6"/>
-    <w:basedOn w:val="660"/>
-    <w:next w:val="660"/>
-    <w:link w:val="676"/>
+    <w:basedOn w:val="697"/>
+    <w:next w:val="697"/>
+    <w:link w:val="713"/>
     <w:uiPriority w:val="9"/>
     <w:unhideWhenUsed/>
     <w:qFormat/>
@@ -624,11 +619,11 @@
       <w:color w:val="595959" w:themeColor="text1" w:themeTint="A6"/>
     </w:rPr>
   </w:style>
-  <w:style w:type="paragraph" w:styleId="667">
+  <w:style w:type="paragraph" w:styleId="704">
     <w:name w:val="Heading 7"/>
-    <w:basedOn w:val="660"/>
-    <w:next w:val="660"/>
-    <w:link w:val="677"/>
+    <w:basedOn w:val="697"/>
+    <w:next w:val="697"/>
+    <w:link w:val="714"/>
     <w:uiPriority w:val="9"/>
     <w:unhideWhenUsed/>
     <w:qFormat/>
@@ -645,11 +640,11 @@
       <w:color w:val="595959" w:themeColor="text1" w:themeTint="A6"/>
     </w:rPr>
   </w:style>
-  <w:style w:type="paragraph" w:styleId="668">
+  <w:style w:type="paragraph" w:styleId="705">
     <w:name w:val="Heading 8"/>
-    <w:basedOn w:val="660"/>
-    <w:next w:val="660"/>
-    <w:link w:val="678"/>
+    <w:basedOn w:val="697"/>
+    <w:next w:val="697"/>
+    <w:link w:val="715"/>
     <w:uiPriority w:val="9"/>
     <w:unhideWhenUsed/>
     <w:qFormat/>
@@ -668,11 +663,11 @@
       <w:color w:val="272727" w:themeColor="text1" w:themeTint="D8"/>
     </w:rPr>
   </w:style>
-  <w:style w:type="paragraph" w:styleId="669">
+  <w:style w:type="paragraph" w:styleId="706">
     <w:name w:val="Heading 9"/>
-    <w:basedOn w:val="660"/>
-    <w:next w:val="660"/>
-    <w:link w:val="679"/>
+    <w:basedOn w:val="697"/>
+    <w:next w:val="697"/>
+    <w:link w:val="716"/>
     <w:uiPriority w:val="9"/>
     <w:unhideWhenUsed/>
     <w:qFormat/>
@@ -691,7 +686,7 @@
       <w:color w:val="272727" w:themeColor="text1" w:themeTint="D8"/>
     </w:rPr>
   </w:style>
-  <w:style w:type="character" w:styleId="670" w:default="1">
+  <w:style w:type="character" w:styleId="707" w:default="1">
     <w:name w:val="Default Paragraph Font"/>
     <w:uiPriority w:val="1"/>
     <w:semiHidden/>
@@ -703,10 +698,10 @@
       <w:ind/>
     </w:pPr>
   </w:style>
-  <w:style w:type="character" w:styleId="671">
+  <w:style w:type="character" w:styleId="708">
     <w:name w:val="Heading 1 Char"/>
-    <w:basedOn w:val="670"/>
-    <w:link w:val="661"/>
+    <w:basedOn w:val="707"/>
+    <w:link w:val="698"/>
     <w:uiPriority w:val="9"/>
     <w:qFormat/>
     <w:pPr>
@@ -721,10 +716,10 @@
       <w:szCs w:val="40"/>
     </w:rPr>
   </w:style>
-  <w:style w:type="character" w:styleId="672">
+  <w:style w:type="character" w:styleId="709">
     <w:name w:val="Heading 2 Char"/>
-    <w:basedOn w:val="670"/>
-    <w:link w:val="662"/>
+    <w:basedOn w:val="707"/>
+    <w:link w:val="699"/>
     <w:uiPriority w:val="9"/>
     <w:qFormat/>
     <w:pPr>
@@ -739,10 +734,10 @@
       <w:szCs w:val="32"/>
     </w:rPr>
   </w:style>
-  <w:style w:type="character" w:styleId="673">
+  <w:style w:type="character" w:styleId="710">
     <w:name w:val="Heading 3 Char"/>
-    <w:basedOn w:val="670"/>
-    <w:link w:val="663"/>
+    <w:basedOn w:val="707"/>
+    <w:link w:val="700"/>
     <w:uiPriority w:val="9"/>
     <w:qFormat/>
     <w:pPr>
@@ -757,10 +752,10 @@
       <w:szCs w:val="28"/>
     </w:rPr>
   </w:style>
-  <w:style w:type="character" w:styleId="674">
+  <w:style w:type="character" w:styleId="711">
     <w:name w:val="Heading 4 Char"/>
-    <w:basedOn w:val="670"/>
-    <w:link w:val="664"/>
+    <w:basedOn w:val="707"/>
+    <w:link w:val="701"/>
     <w:uiPriority w:val="9"/>
     <w:qFormat/>
     <w:pPr>
@@ -775,10 +770,10 @@
       <w:color w:val="0f4761" w:themeColor="accent1" w:themeShade="BF"/>
     </w:rPr>
   </w:style>
-  <w:style w:type="character" w:styleId="675">
+  <w:style w:type="character" w:styleId="712">
     <w:name w:val="Heading 5 Char"/>
-    <w:basedOn w:val="670"/>
-    <w:link w:val="665"/>
+    <w:basedOn w:val="707"/>
+    <w:link w:val="702"/>
     <w:uiPriority w:val="9"/>
     <w:qFormat/>
     <w:pPr>
@@ -791,10 +786,10 @@
       <w:color w:val="0f4761" w:themeColor="accent1" w:themeShade="BF"/>
     </w:rPr>
   </w:style>
-  <w:style w:type="character" w:styleId="676">
+  <w:style w:type="character" w:styleId="713">
     <w:name w:val="Heading 6 Char"/>
-    <w:basedOn w:val="670"/>
-    <w:link w:val="666"/>
+    <w:basedOn w:val="707"/>
+    <w:link w:val="703"/>
     <w:uiPriority w:val="9"/>
     <w:qFormat/>
     <w:pPr>
@@ -809,10 +804,10 @@
       <w:color w:val="595959" w:themeColor="text1" w:themeTint="A6"/>
     </w:rPr>
   </w:style>
-  <w:style w:type="character" w:styleId="677">
+  <w:style w:type="character" w:styleId="714">
     <w:name w:val="Heading 7 Char"/>
-    <w:basedOn w:val="670"/>
-    <w:link w:val="667"/>
+    <w:basedOn w:val="707"/>
+    <w:link w:val="704"/>
     <w:uiPriority w:val="9"/>
     <w:qFormat/>
     <w:pPr>
@@ -825,10 +820,10 @@
       <w:color w:val="595959" w:themeColor="text1" w:themeTint="A6"/>
     </w:rPr>
   </w:style>
-  <w:style w:type="character" w:styleId="678">
+  <w:style w:type="character" w:styleId="715">
     <w:name w:val="Heading 8 Char"/>
-    <w:basedOn w:val="670"/>
-    <w:link w:val="668"/>
+    <w:basedOn w:val="707"/>
+    <w:link w:val="705"/>
     <w:uiPriority w:val="9"/>
     <w:qFormat/>
     <w:pPr>
@@ -843,10 +838,10 @@
       <w:color w:val="272727" w:themeColor="text1" w:themeTint="D8"/>
     </w:rPr>
   </w:style>
-  <w:style w:type="character" w:styleId="679">
+  <w:style w:type="character" w:styleId="716">
     <w:name w:val="Heading 9 Char"/>
-    <w:basedOn w:val="670"/>
-    <w:link w:val="669"/>
+    <w:basedOn w:val="707"/>
+    <w:link w:val="706"/>
     <w:uiPriority w:val="9"/>
     <w:qFormat/>
     <w:pPr>
@@ -861,10 +856,10 @@
       <w:color w:val="272727" w:themeColor="text1" w:themeTint="D8"/>
     </w:rPr>
   </w:style>
-  <w:style w:type="character" w:styleId="680">
+  <w:style w:type="character" w:styleId="717">
     <w:name w:val="Title Char"/>
-    <w:basedOn w:val="670"/>
-    <w:link w:val="706"/>
+    <w:basedOn w:val="707"/>
+    <w:link w:val="743"/>
     <w:uiPriority w:val="10"/>
     <w:qFormat/>
     <w:pPr>
@@ -879,10 +874,10 @@
       <w:szCs w:val="56"/>
     </w:rPr>
   </w:style>
-  <w:style w:type="character" w:styleId="681">
+  <w:style w:type="character" w:styleId="718">
     <w:name w:val="Subtitle Char"/>
-    <w:basedOn w:val="670"/>
-    <w:link w:val="707"/>
+    <w:basedOn w:val="707"/>
+    <w:link w:val="744"/>
     <w:uiPriority w:val="11"/>
     <w:qFormat/>
     <w:pPr>
@@ -897,10 +892,10 @@
       <w:szCs w:val="28"/>
     </w:rPr>
   </w:style>
-  <w:style w:type="character" w:styleId="682">
+  <w:style w:type="character" w:styleId="719">
     <w:name w:val="Quote Char"/>
-    <w:basedOn w:val="670"/>
-    <w:link w:val="708"/>
+    <w:basedOn w:val="707"/>
+    <w:link w:val="745"/>
     <w:uiPriority w:val="29"/>
     <w:qFormat/>
     <w:pPr>
@@ -914,9 +909,9 @@
       <w:color w:val="404040" w:themeColor="text1" w:themeTint="BF"/>
     </w:rPr>
   </w:style>
-  <w:style w:type="character" w:styleId="683">
+  <w:style w:type="character" w:styleId="720">
     <w:name w:val="Intense Emphasis"/>
-    <w:basedOn w:val="670"/>
+    <w:basedOn w:val="707"/>
     <w:uiPriority w:val="21"/>
     <w:qFormat/>
     <w:pPr>
@@ -930,10 +925,10 @@
       <w:color w:val="0f4761" w:themeColor="accent1" w:themeShade="BF"/>
     </w:rPr>
   </w:style>
-  <w:style w:type="character" w:styleId="684">
+  <w:style w:type="character" w:styleId="721">
     <w:name w:val="Intense Quote Char"/>
-    <w:basedOn w:val="670"/>
-    <w:link w:val="710"/>
+    <w:basedOn w:val="707"/>
+    <w:link w:val="747"/>
     <w:uiPriority w:val="30"/>
     <w:qFormat/>
     <w:pPr>
@@ -947,9 +942,9 @@
       <w:color w:val="0f4761" w:themeColor="accent1" w:themeShade="BF"/>
     </w:rPr>
   </w:style>
-  <w:style w:type="character" w:styleId="685">
+  <w:style w:type="character" w:styleId="722">
     <w:name w:val="Intense Reference"/>
-    <w:basedOn w:val="670"/>
+    <w:basedOn w:val="707"/>
     <w:uiPriority w:val="32"/>
     <w:qFormat/>
     <w:pPr>
@@ -965,9 +960,9 @@
       <w:spacing w:val="5"/>
     </w:rPr>
   </w:style>
-  <w:style w:type="character" w:styleId="686">
+  <w:style w:type="character" w:styleId="723">
     <w:name w:val="Subtle Emphasis"/>
-    <w:basedOn w:val="670"/>
+    <w:basedOn w:val="707"/>
     <w:uiPriority w:val="19"/>
     <w:qFormat/>
     <w:pPr>
@@ -981,9 +976,9 @@
       <w:color w:val="404040" w:themeColor="text1" w:themeTint="BF"/>
     </w:rPr>
   </w:style>
-  <w:style w:type="character" w:styleId="687">
+  <w:style w:type="character" w:styleId="724">
     <w:name w:val="Emphasis"/>
-    <w:basedOn w:val="670"/>
+    <w:basedOn w:val="707"/>
     <w:uiPriority w:val="20"/>
     <w:qFormat/>
     <w:pPr>
@@ -996,9 +991,9 @@
       <w:iCs/>
     </w:rPr>
   </w:style>
-  <w:style w:type="character" w:styleId="688">
+  <w:style w:type="character" w:styleId="725">
     <w:name w:val="Strong"/>
-    <w:basedOn w:val="670"/>
+    <w:basedOn w:val="707"/>
     <w:uiPriority w:val="22"/>
     <w:qFormat/>
     <w:pPr>
@@ -1011,9 +1006,9 @@
       <w:bCs/>
     </w:rPr>
   </w:style>
-  <w:style w:type="character" w:styleId="689">
+  <w:style w:type="character" w:styleId="726">
     <w:name w:val="Subtle Reference"/>
-    <w:basedOn w:val="670"/>
+    <w:basedOn w:val="707"/>
     <w:uiPriority w:val="31"/>
     <w:qFormat/>
     <w:pPr>
@@ -1026,9 +1021,9 @@
       <w:color w:val="5a5a5a" w:themeColor="text1" w:themeTint="A5"/>
     </w:rPr>
   </w:style>
-  <w:style w:type="character" w:styleId="690">
+  <w:style w:type="character" w:styleId="727">
     <w:name w:val="Book Title"/>
-    <w:basedOn w:val="670"/>
+    <w:basedOn w:val="707"/>
     <w:uiPriority w:val="33"/>
     <w:qFormat/>
     <w:pPr>
@@ -1044,10 +1039,10 @@
       <w:spacing w:val="5"/>
     </w:rPr>
   </w:style>
-  <w:style w:type="character" w:styleId="691">
+  <w:style w:type="character" w:styleId="728">
     <w:name w:val="Header Char"/>
-    <w:basedOn w:val="670"/>
-    <w:link w:val="713"/>
+    <w:basedOn w:val="707"/>
+    <w:link w:val="750"/>
     <w:uiPriority w:val="99"/>
     <w:qFormat/>
     <w:pPr>
@@ -1056,10 +1051,10 @@
       <w:ind/>
     </w:pPr>
   </w:style>
-  <w:style w:type="character" w:styleId="692">
+  <w:style w:type="character" w:styleId="729">
     <w:name w:val="Footer Char"/>
-    <w:basedOn w:val="670"/>
-    <w:link w:val="714"/>
+    <w:basedOn w:val="707"/>
+    <w:link w:val="751"/>
     <w:uiPriority w:val="99"/>
     <w:qFormat/>
     <w:pPr>
@@ -1068,10 +1063,10 @@
       <w:ind/>
     </w:pPr>
   </w:style>
-  <w:style w:type="character" w:styleId="693">
+  <w:style w:type="character" w:styleId="730">
     <w:name w:val="Footnote Text Char"/>
-    <w:basedOn w:val="670"/>
-    <w:link w:val="715"/>
+    <w:basedOn w:val="707"/>
+    <w:link w:val="752"/>
     <w:uiPriority w:val="99"/>
     <w:semiHidden/>
     <w:qFormat/>
@@ -1085,7 +1080,7 @@
       <w:szCs w:val="20"/>
     </w:rPr>
   </w:style>
-  <w:style w:type="character" w:styleId="694">
+  <w:style w:type="character" w:styleId="731">
     <w:name w:val="Footnote Characters"/>
     <w:uiPriority w:val="99"/>
     <w:semiHidden/>
@@ -1100,7 +1095,7 @@
       <w:vertAlign w:val="superscript"/>
     </w:rPr>
   </w:style>
-  <w:style w:type="character" w:styleId="695">
+  <w:style w:type="character" w:styleId="732">
     <w:name w:val="footnote reference"/>
     <w:pPr>
       <w:pBdr/>
@@ -1111,10 +1106,10 @@
       <w:vertAlign w:val="superscript"/>
     </w:rPr>
   </w:style>
-  <w:style w:type="character" w:styleId="696">
+  <w:style w:type="character" w:styleId="733">
     <w:name w:val="Endnote Text Char"/>
-    <w:basedOn w:val="670"/>
-    <w:link w:val="716"/>
+    <w:basedOn w:val="707"/>
+    <w:link w:val="753"/>
     <w:uiPriority w:val="99"/>
     <w:semiHidden/>
     <w:qFormat/>
@@ -1128,7 +1123,7 @@
       <w:szCs w:val="20"/>
     </w:rPr>
   </w:style>
-  <w:style w:type="character" w:styleId="697">
+  <w:style w:type="character" w:styleId="734">
     <w:name w:val="Endnote Characters"/>
     <w:uiPriority w:val="99"/>
     <w:semiHidden/>
@@ -1143,7 +1138,7 @@
       <w:vertAlign w:val="superscript"/>
     </w:rPr>
   </w:style>
-  <w:style w:type="character" w:styleId="698">
+  <w:style w:type="character" w:styleId="735">
     <w:name w:val="endnote reference"/>
     <w:pPr>
       <w:pBdr/>
@@ -1154,9 +1149,9 @@
       <w:vertAlign w:val="superscript"/>
     </w:rPr>
   </w:style>
-  <w:style w:type="character" w:styleId="699">
+  <w:style w:type="character" w:styleId="736">
     <w:name w:val="Hyperlink"/>
-    <w:basedOn w:val="670"/>
+    <w:basedOn w:val="707"/>
     <w:uiPriority w:val="99"/>
     <w:unhideWhenUsed/>
     <w:pPr>
@@ -1169,9 +1164,9 @@
       <w:u w:val="single"/>
     </w:rPr>
   </w:style>
-  <w:style w:type="character" w:styleId="700">
+  <w:style w:type="character" w:styleId="737">
     <w:name w:val="FollowedHyperlink"/>
-    <w:basedOn w:val="670"/>
+    <w:basedOn w:val="707"/>
     <w:uiPriority w:val="99"/>
     <w:semiHidden/>
     <w:unhideWhenUsed/>
@@ -1185,10 +1180,10 @@
       <w:u w:val="single"/>
     </w:rPr>
   </w:style>
-  <w:style w:type="paragraph" w:styleId="701">
+  <w:style w:type="paragraph" w:styleId="738">
     <w:name w:val="Heading"/>
-    <w:basedOn w:val="660"/>
-    <w:next w:val="702"/>
+    <w:basedOn w:val="697"/>
+    <w:next w:val="739"/>
     <w:qFormat/>
     <w:pPr>
       <w:keepNext w:val="true"/>
@@ -1202,18 +1197,18 @@
       <w:szCs w:val="28"/>
     </w:rPr>
   </w:style>
-  <w:style w:type="paragraph" w:styleId="702">
+  <w:style w:type="paragraph" w:styleId="739">
     <w:name w:val="Body Text"/>
-    <w:basedOn w:val="660"/>
+    <w:basedOn w:val="697"/>
     <w:pPr>
       <w:pBdr/>
       <w:spacing w:after="140" w:before="0" w:line="276" w:lineRule="auto"/>
       <w:ind/>
     </w:pPr>
   </w:style>
-  <w:style w:type="paragraph" w:styleId="703">
+  <w:style w:type="paragraph" w:styleId="740">
     <w:name w:val="List"/>
-    <w:basedOn w:val="702"/>
+    <w:basedOn w:val="739"/>
     <w:pPr>
       <w:pBdr/>
       <w:spacing/>
@@ -1223,9 +1218,9 @@
       <w:rFonts w:cs="Noto Sans Devanagari"/>
     </w:rPr>
   </w:style>
-  <w:style w:type="paragraph" w:styleId="704">
+  <w:style w:type="paragraph" w:styleId="741">
     <w:name w:val="Caption"/>
-    <w:basedOn w:val="660"/>
+    <w:basedOn w:val="697"/>
     <w:qFormat/>
     <w:pPr>
       <w:suppressLineNumbers w:val="true"/>
@@ -1241,9 +1236,9 @@
       <w:szCs w:val="24"/>
     </w:rPr>
   </w:style>
-  <w:style w:type="paragraph" w:styleId="705">
+  <w:style w:type="paragraph" w:styleId="742">
     <w:name w:val="Index"/>
-    <w:basedOn w:val="660"/>
+    <w:basedOn w:val="697"/>
     <w:qFormat/>
     <w:pPr>
       <w:suppressLineNumbers w:val="true"/>
@@ -1255,11 +1250,11 @@
       <w:rFonts w:cs="Noto Sans Devanagari"/>
     </w:rPr>
   </w:style>
-  <w:style w:type="paragraph" w:styleId="706">
+  <w:style w:type="paragraph" w:styleId="743">
     <w:name w:val="Title"/>
-    <w:basedOn w:val="660"/>
-    <w:next w:val="660"/>
-    <w:link w:val="680"/>
+    <w:basedOn w:val="697"/>
+    <w:next w:val="697"/>
+    <w:link w:val="717"/>
     <w:uiPriority w:val="10"/>
     <w:qFormat/>
     <w:pPr>
@@ -1275,11 +1270,11 @@
       <w:szCs w:val="56"/>
     </w:rPr>
   </w:style>
-  <w:style w:type="paragraph" w:styleId="707">
+  <w:style w:type="paragraph" w:styleId="744">
     <w:name w:val="Subtitle"/>
-    <w:basedOn w:val="660"/>
-    <w:next w:val="660"/>
-    <w:link w:val="681"/>
+    <w:basedOn w:val="697"/>
+    <w:next w:val="697"/>
+    <w:link w:val="718"/>
     <w:uiPriority w:val="11"/>
     <w:qFormat/>
     <w:pPr>
@@ -1294,11 +1289,11 @@
       <w:szCs w:val="28"/>
     </w:rPr>
   </w:style>
-  <w:style w:type="paragraph" w:styleId="708">
+  <w:style w:type="paragraph" w:styleId="745">
     <w:name w:val="Quote"/>
-    <w:basedOn w:val="660"/>
-    <w:next w:val="660"/>
-    <w:link w:val="682"/>
+    <w:basedOn w:val="697"/>
+    <w:next w:val="697"/>
+    <w:link w:val="719"/>
     <w:uiPriority w:val="29"/>
     <w:qFormat/>
     <w:pPr>
@@ -1313,9 +1308,9 @@
       <w:color w:val="404040" w:themeColor="text1" w:themeTint="BF"/>
     </w:rPr>
   </w:style>
-  <w:style w:type="paragraph" w:styleId="709">
+  <w:style w:type="paragraph" w:styleId="746">
     <w:name w:val="List Paragraph"/>
-    <w:basedOn w:val="660"/>
+    <w:basedOn w:val="697"/>
     <w:uiPriority w:val="34"/>
     <w:qFormat/>
     <w:pPr>
@@ -1325,11 +1320,11 @@
       <w:contextualSpacing w:val="true"/>
     </w:pPr>
   </w:style>
-  <w:style w:type="paragraph" w:styleId="710">
+  <w:style w:type="paragraph" w:styleId="747">
     <w:name w:val="Intense Quote"/>
-    <w:basedOn w:val="660"/>
-    <w:next w:val="660"/>
-    <w:link w:val="684"/>
+    <w:basedOn w:val="697"/>
+    <w:next w:val="697"/>
+    <w:link w:val="721"/>
     <w:uiPriority w:val="30"/>
     <w:qFormat/>
     <w:pPr>
@@ -1347,9 +1342,9 @@
       <w:color w:val="0f4761" w:themeColor="accent1" w:themeShade="BF"/>
     </w:rPr>
   </w:style>
-  <w:style w:type="paragraph" w:styleId="711">
+  <w:style w:type="paragraph" w:styleId="748">
     <w:name w:val="No Spacing"/>
-    <w:basedOn w:val="660"/>
+    <w:basedOn w:val="697"/>
     <w:uiPriority w:val="1"/>
     <w:qFormat/>
     <w:pPr>
@@ -1358,9 +1353,9 @@
       <w:ind/>
     </w:pPr>
   </w:style>
-  <w:style w:type="paragraph" w:styleId="712">
+  <w:style w:type="paragraph" w:styleId="749">
     <w:name w:val="Header and Footer"/>
-    <w:basedOn w:val="660"/>
+    <w:basedOn w:val="697"/>
     <w:qFormat/>
     <w:pPr>
       <w:pBdr/>
@@ -1368,10 +1363,10 @@
       <w:ind/>
     </w:pPr>
   </w:style>
-  <w:style w:type="paragraph" w:styleId="713">
+  <w:style w:type="paragraph" w:styleId="750">
     <w:name w:val="Header"/>
-    <w:basedOn w:val="660"/>
-    <w:link w:val="691"/>
+    <w:basedOn w:val="697"/>
+    <w:link w:val="728"/>
     <w:uiPriority w:val="99"/>
     <w:unhideWhenUsed/>
     <w:pPr>
@@ -1385,10 +1380,10 @@
       <w:ind/>
     </w:pPr>
   </w:style>
-  <w:style w:type="paragraph" w:styleId="714">
+  <w:style w:type="paragraph" w:styleId="751">
     <w:name w:val="Footer"/>
-    <w:basedOn w:val="660"/>
-    <w:link w:val="692"/>
+    <w:basedOn w:val="697"/>
+    <w:link w:val="729"/>
     <w:uiPriority w:val="99"/>
     <w:unhideWhenUsed/>
     <w:pPr>
@@ -1402,10 +1397,10 @@
       <w:ind/>
     </w:pPr>
   </w:style>
-  <w:style w:type="paragraph" w:styleId="715">
+  <w:style w:type="paragraph" w:styleId="752">
     <w:name w:val="footnote text"/>
-    <w:basedOn w:val="660"/>
-    <w:link w:val="693"/>
+    <w:basedOn w:val="697"/>
+    <w:link w:val="730"/>
     <w:uiPriority w:val="99"/>
     <w:semiHidden/>
     <w:unhideWhenUsed/>
@@ -1419,10 +1414,10 @@
       <w:szCs w:val="20"/>
     </w:rPr>
   </w:style>
-  <w:style w:type="paragraph" w:styleId="716">
+  <w:style w:type="paragraph" w:styleId="753">
     <w:name w:val="endnote text"/>
-    <w:basedOn w:val="660"/>
-    <w:link w:val="696"/>
+    <w:basedOn w:val="697"/>
+    <w:link w:val="733"/>
     <w:uiPriority w:val="99"/>
     <w:semiHidden/>
     <w:unhideWhenUsed/>
@@ -1436,10 +1431,10 @@
       <w:szCs w:val="20"/>
     </w:rPr>
   </w:style>
-  <w:style w:type="paragraph" w:styleId="717">
+  <w:style w:type="paragraph" w:styleId="754">
     <w:name w:val="toc 1"/>
-    <w:basedOn w:val="660"/>
-    <w:next w:val="660"/>
+    <w:basedOn w:val="697"/>
+    <w:next w:val="697"/>
     <w:uiPriority w:val="39"/>
     <w:unhideWhenUsed/>
     <w:pPr>
@@ -1448,10 +1443,10 @@
       <w:ind/>
     </w:pPr>
   </w:style>
-  <w:style w:type="paragraph" w:styleId="718">
+  <w:style w:type="paragraph" w:styleId="755">
     <w:name w:val="toc 2"/>
-    <w:basedOn w:val="660"/>
-    <w:next w:val="660"/>
+    <w:basedOn w:val="697"/>
+    <w:next w:val="697"/>
     <w:uiPriority w:val="39"/>
     <w:unhideWhenUsed/>
     <w:pPr>
@@ -1460,10 +1455,10 @@
       <w:ind w:left="220"/>
     </w:pPr>
   </w:style>
-  <w:style w:type="paragraph" w:styleId="719">
+  <w:style w:type="paragraph" w:styleId="756">
     <w:name w:val="toc 3"/>
-    <w:basedOn w:val="660"/>
-    <w:next w:val="660"/>
+    <w:basedOn w:val="697"/>
+    <w:next w:val="697"/>
     <w:uiPriority w:val="39"/>
     <w:unhideWhenUsed/>
     <w:pPr>
@@ -1472,10 +1467,10 @@
       <w:ind w:left="440"/>
     </w:pPr>
   </w:style>
-  <w:style w:type="paragraph" w:styleId="720">
+  <w:style w:type="paragraph" w:styleId="757">
     <w:name w:val="toc 4"/>
-    <w:basedOn w:val="660"/>
-    <w:next w:val="660"/>
+    <w:basedOn w:val="697"/>
+    <w:next w:val="697"/>
     <w:uiPriority w:val="39"/>
     <w:unhideWhenUsed/>
     <w:pPr>
@@ -1484,10 +1479,10 @@
       <w:ind w:left="660"/>
     </w:pPr>
   </w:style>
-  <w:style w:type="paragraph" w:styleId="721">
+  <w:style w:type="paragraph" w:styleId="758">
     <w:name w:val="toc 5"/>
-    <w:basedOn w:val="660"/>
-    <w:next w:val="660"/>
+    <w:basedOn w:val="697"/>
+    <w:next w:val="697"/>
     <w:uiPriority w:val="39"/>
     <w:unhideWhenUsed/>
     <w:pPr>
@@ -1496,10 +1491,10 @@
       <w:ind w:left="880"/>
     </w:pPr>
   </w:style>
-  <w:style w:type="paragraph" w:styleId="722">
+  <w:style w:type="paragraph" w:styleId="759">
     <w:name w:val="toc 6"/>
-    <w:basedOn w:val="660"/>
-    <w:next w:val="660"/>
+    <w:basedOn w:val="697"/>
+    <w:next w:val="697"/>
     <w:uiPriority w:val="39"/>
     <w:unhideWhenUsed/>
     <w:pPr>
@@ -1508,10 +1503,10 @@
       <w:ind w:left="1100"/>
     </w:pPr>
   </w:style>
-  <w:style w:type="paragraph" w:styleId="723">
+  <w:style w:type="paragraph" w:styleId="760">
     <w:name w:val="toc 7"/>
-    <w:basedOn w:val="660"/>
-    <w:next w:val="660"/>
+    <w:basedOn w:val="697"/>
+    <w:next w:val="697"/>
     <w:uiPriority w:val="39"/>
     <w:unhideWhenUsed/>
     <w:pPr>
@@ -1520,10 +1515,10 @@
       <w:ind w:left="1320"/>
     </w:pPr>
   </w:style>
-  <w:style w:type="paragraph" w:styleId="724">
+  <w:style w:type="paragraph" w:styleId="761">
     <w:name w:val="toc 8"/>
-    <w:basedOn w:val="660"/>
-    <w:next w:val="660"/>
+    <w:basedOn w:val="697"/>
+    <w:next w:val="697"/>
     <w:uiPriority w:val="39"/>
     <w:unhideWhenUsed/>
     <w:pPr>
@@ -1532,10 +1527,10 @@
       <w:ind w:left="1540"/>
     </w:pPr>
   </w:style>
-  <w:style w:type="paragraph" w:styleId="725">
+  <w:style w:type="paragraph" w:styleId="762">
     <w:name w:val="toc 9"/>
-    <w:basedOn w:val="660"/>
-    <w:next w:val="660"/>
+    <w:basedOn w:val="697"/>
+    <w:next w:val="697"/>
     <w:uiPriority w:val="39"/>
     <w:unhideWhenUsed/>
     <w:pPr>
@@ -1544,16 +1539,16 @@
       <w:ind w:left="1760"/>
     </w:pPr>
   </w:style>
-  <w:style w:type="paragraph" w:styleId="726">
+  <w:style w:type="paragraph" w:styleId="763">
     <w:name w:val="Index Heading"/>
-    <w:basedOn w:val="701"/>
+    <w:basedOn w:val="738"/>
     <w:pPr>
       <w:pBdr/>
       <w:spacing/>
       <w:ind/>
     </w:pPr>
   </w:style>
-  <w:style w:type="paragraph" w:styleId="727">
+  <w:style w:type="paragraph" w:styleId="764">
     <w:name w:val="TOC Heading"/>
     <w:uiPriority w:val="39"/>
     <w:unhideWhenUsed/>
@@ -1574,10 +1569,10 @@
       <w:lang w:val="en-US" w:eastAsia="zh-CN" w:bidi="hi-IN"/>
     </w:rPr>
   </w:style>
-  <w:style w:type="paragraph" w:styleId="728">
+  <w:style w:type="paragraph" w:styleId="765">
     <w:name w:val="table of figures"/>
-    <w:basedOn w:val="660"/>
-    <w:next w:val="660"/>
+    <w:basedOn w:val="697"/>
+    <w:next w:val="697"/>
     <w:uiPriority w:val="99"/>
     <w:unhideWhenUsed/>
     <w:pPr>
@@ -1586,9 +1581,9 @@
       <w:ind/>
     </w:pPr>
   </w:style>
-  <w:style w:type="paragraph" w:styleId="729">
+  <w:style w:type="paragraph" w:styleId="766">
     <w:name w:val="Frame Contents"/>
-    <w:basedOn w:val="660"/>
+    <w:basedOn w:val="697"/>
     <w:qFormat/>
     <w:pPr>
       <w:pBdr/>
@@ -1596,7 +1591,7 @@
       <w:ind/>
     </w:pPr>
   </w:style>
-  <w:style w:type="numbering" w:styleId="730" w:default="1">
+  <w:style w:type="numbering" w:styleId="767" w:default="1">
     <w:name w:val="No List"/>
     <w:uiPriority w:val="99"/>
     <w:semiHidden/>
@@ -1608,7 +1603,7 @@
       <w:ind/>
     </w:pPr>
   </w:style>
-  <w:style w:type="table" w:styleId="731" w:default="1">
+  <w:style w:type="table" w:styleId="768" w:default="1">
     <w:name w:val="Normal Table"/>
     <w:uiPriority w:val="99"/>
     <w:semiHidden/>
@@ -1800,9 +1795,9 @@
       </w:tcPr>
     </w:tblStylePr>
   </w:style>
-  <w:style w:type="table" w:styleId="732">
+  <w:style w:type="table" w:styleId="769">
     <w:name w:val="Table Grid"/>
-    <w:basedOn w:val="731"/>
+    <w:basedOn w:val="768"/>
     <w:uiPriority w:val="59"/>
     <w:pPr>
       <w:pBdr/>
@@ -1998,9 +1993,9 @@
       </w:tcPr>
     </w:tblStylePr>
   </w:style>
-  <w:style w:type="table" w:styleId="733">
+  <w:style w:type="table" w:styleId="770">
     <w:name w:val="Table Grid Light"/>
-    <w:basedOn w:val="731"/>
+    <w:basedOn w:val="768"/>
     <w:uiPriority w:val="59"/>
     <w:pPr>
       <w:pBdr/>
@@ -2196,9 +2191,9 @@
       </w:tcPr>
     </w:tblStylePr>
   </w:style>
-  <w:style w:type="table" w:styleId="734">
+  <w:style w:type="table" w:styleId="771">
     <w:name w:val="Plain Table 1"/>
-    <w:basedOn w:val="731"/>
+    <w:basedOn w:val="768"/>
     <w:uiPriority w:val="59"/>
     <w:pPr>
       <w:pBdr/>
@@ -2412,9 +2407,9 @@
       </w:tcPr>
     </w:tblStylePr>
   </w:style>
-  <w:style w:type="table" w:styleId="735">
+  <w:style w:type="table" w:styleId="772">
     <w:name w:val="Plain Table 2"/>
-    <w:basedOn w:val="731"/>
+    <w:basedOn w:val="768"/>
     <w:uiPriority w:val="59"/>
     <w:pPr>
       <w:pBdr/>
@@ -2636,9 +2631,9 @@
       </w:tcPr>
     </w:tblStylePr>
   </w:style>
-  <w:style w:type="table" w:styleId="736">
+  <w:style w:type="table" w:styleId="773">
     <w:name w:val="Plain Table 3"/>
-    <w:basedOn w:val="731"/>
+    <w:basedOn w:val="768"/>
     <w:uiPriority w:val="99"/>
     <w:pPr>
       <w:pBdr/>
@@ -2857,9 +2852,9 @@
       </w:tcPr>
     </w:tblStylePr>
   </w:style>
-  <w:style w:type="table" w:styleId="737">
+  <w:style w:type="table" w:styleId="774">
     <w:name w:val="Plain Table 4"/>
-    <w:basedOn w:val="731"/>
+    <w:basedOn w:val="768"/>
     <w:uiPriority w:val="99"/>
     <w:pPr>
       <w:pBdr/>
@@ -3064,9 +3059,9 @@
       </w:tcPr>
     </w:tblStylePr>
   </w:style>
-  <w:style w:type="table" w:styleId="738">
+  <w:style w:type="table" w:styleId="775">
     <w:name w:val="Plain Table 5"/>
-    <w:basedOn w:val="731"/>
+    <w:basedOn w:val="768"/>
     <w:uiPriority w:val="99"/>
     <w:pPr>
       <w:pBdr/>
@@ -3288,9 +3283,9 @@
       </w:tcPr>
     </w:tblStylePr>
   </w:style>
-  <w:style w:type="table" w:styleId="739">
+  <w:style w:type="table" w:styleId="776">
     <w:name w:val="Grid Table 1 Light"/>
-    <w:basedOn w:val="731"/>
+    <w:basedOn w:val="768"/>
     <w:uiPriority w:val="99"/>
     <w:pPr>
       <w:pBdr/>
@@ -3504,9 +3499,9 @@
       </w:tcPr>
     </w:tblStylePr>
   </w:style>
-  <w:style w:type="table" w:styleId="740">
+  <w:style w:type="table" w:styleId="777">
     <w:name w:val="Grid Table 1 Light - Accent 1"/>
-    <w:basedOn w:val="731"/>
+    <w:basedOn w:val="768"/>
     <w:uiPriority w:val="99"/>
     <w:pPr>
       <w:pBdr/>
@@ -3720,9 +3715,9 @@
       </w:tcPr>
     </w:tblStylePr>
   </w:style>
-  <w:style w:type="table" w:styleId="741">
+  <w:style w:type="table" w:styleId="778">
     <w:name w:val="Grid Table 1 Light - Accent 2"/>
-    <w:basedOn w:val="731"/>
+    <w:basedOn w:val="768"/>
     <w:uiPriority w:val="99"/>
     <w:pPr>
       <w:pBdr/>
@@ -3936,9 +3931,9 @@
       </w:tcPr>
     </w:tblStylePr>
   </w:style>
-  <w:style w:type="table" w:styleId="742">
+  <w:style w:type="table" w:styleId="779">
     <w:name w:val="Grid Table 1 Light - Accent 3"/>
-    <w:basedOn w:val="731"/>
+    <w:basedOn w:val="768"/>
     <w:uiPriority w:val="99"/>
     <w:pPr>
       <w:pBdr/>
@@ -4152,9 +4147,9 @@
       </w:tcPr>
     </w:tblStylePr>
   </w:style>
-  <w:style w:type="table" w:styleId="743">
+  <w:style w:type="table" w:styleId="780">
     <w:name w:val="Grid Table 1 Light - Accent 4"/>
-    <w:basedOn w:val="731"/>
+    <w:basedOn w:val="768"/>
     <w:uiPriority w:val="99"/>
     <w:pPr>
       <w:pBdr/>
@@ -4368,9 +4363,9 @@
       </w:tcPr>
     </w:tblStylePr>
   </w:style>
-  <w:style w:type="table" w:styleId="744">
+  <w:style w:type="table" w:styleId="781">
     <w:name w:val="Grid Table 1 Light - Accent 5"/>
-    <w:basedOn w:val="731"/>
+    <w:basedOn w:val="768"/>
     <w:uiPriority w:val="99"/>
     <w:pPr>
       <w:pBdr/>
@@ -4584,9 +4579,9 @@
       </w:tcPr>
     </w:tblStylePr>
   </w:style>
-  <w:style w:type="table" w:styleId="745">
+  <w:style w:type="table" w:styleId="782">
     <w:name w:val="Grid Table 1 Light - Accent 6"/>
-    <w:basedOn w:val="731"/>
+    <w:basedOn w:val="768"/>
     <w:uiPriority w:val="99"/>
     <w:pPr>
       <w:pBdr/>
@@ -4800,9 +4795,9 @@
       </w:tcPr>
     </w:tblStylePr>
   </w:style>
-  <w:style w:type="table" w:styleId="746">
+  <w:style w:type="table" w:styleId="783">
     <w:name w:val="Grid Table 2"/>
-    <w:basedOn w:val="731"/>
+    <w:basedOn w:val="768"/>
     <w:uiPriority w:val="99"/>
     <w:pPr>
       <w:pBdr/>
@@ -5023,9 +5018,9 @@
       </w:tcPr>
     </w:tblStylePr>
   </w:style>
-  <w:style w:type="table" w:styleId="747">
+  <w:style w:type="table" w:styleId="784">
     <w:name w:val="Grid Table 2 - Accent 1"/>
-    <w:basedOn w:val="731"/>
+    <w:basedOn w:val="768"/>
     <w:uiPriority w:val="99"/>
     <w:pPr>
       <w:pBdr/>
@@ -5246,9 +5241,9 @@
       </w:tcPr>
     </w:tblStylePr>
   </w:style>
-  <w:style w:type="table" w:styleId="748">
+  <w:style w:type="table" w:styleId="785">
     <w:name w:val="Grid Table 2 - Accent 2"/>
-    <w:basedOn w:val="731"/>
+    <w:basedOn w:val="768"/>
     <w:uiPriority w:val="99"/>
     <w:pPr>
       <w:pBdr/>
@@ -5469,9 +5464,9 @@
       </w:tcPr>
     </w:tblStylePr>
   </w:style>
-  <w:style w:type="table" w:styleId="749">
+  <w:style w:type="table" w:styleId="786">
     <w:name w:val="Grid Table 2 - Accent 3"/>
-    <w:basedOn w:val="731"/>
+    <w:basedOn w:val="768"/>
     <w:uiPriority w:val="99"/>
     <w:pPr>
       <w:pBdr/>
@@ -5692,9 +5687,9 @@
       </w:tcPr>
     </w:tblStylePr>
   </w:style>
-  <w:style w:type="table" w:styleId="750">
+  <w:style w:type="table" w:styleId="787">
     <w:name w:val="Grid Table 2 - Accent 4"/>
-    <w:basedOn w:val="731"/>
+    <w:basedOn w:val="768"/>
     <w:uiPriority w:val="99"/>
     <w:pPr>
       <w:pBdr/>
@@ -5915,9 +5910,9 @@
       </w:tcPr>
     </w:tblStylePr>
   </w:style>
-  <w:style w:type="table" w:styleId="751">
+  <w:style w:type="table" w:styleId="788">
     <w:name w:val="Grid Table 2 - Accent 5"/>
-    <w:basedOn w:val="731"/>
+    <w:basedOn w:val="768"/>
     <w:uiPriority w:val="99"/>
     <w:pPr>
       <w:pBdr/>
@@ -6138,9 +6133,9 @@
       </w:tcPr>
     </w:tblStylePr>
   </w:style>
-  <w:style w:type="table" w:styleId="752">
+  <w:style w:type="table" w:styleId="789">
     <w:name w:val="Grid Table 2 - Accent 6"/>
-    <w:basedOn w:val="731"/>
+    <w:basedOn w:val="768"/>
     <w:uiPriority w:val="99"/>
     <w:pPr>
       <w:pBdr/>
@@ -6361,9 +6356,9 @@
       </w:tcPr>
     </w:tblStylePr>
   </w:style>
-  <w:style w:type="table" w:styleId="753">
+  <w:style w:type="table" w:styleId="790">
     <w:name w:val="Grid Table 3"/>
-    <w:basedOn w:val="731"/>
+    <w:basedOn w:val="768"/>
     <w:uiPriority w:val="99"/>
     <w:pPr>
       <w:pBdr/>
@@ -6597,9 +6592,9 @@
       </w:tcPr>
     </w:tblStylePr>
   </w:style>
-  <w:style w:type="table" w:styleId="754">
+  <w:style w:type="table" w:styleId="791">
     <w:name w:val="Grid Table 3 - Accent 1"/>
-    <w:basedOn w:val="731"/>
+    <w:basedOn w:val="768"/>
     <w:uiPriority w:val="99"/>
     <w:pPr>
       <w:pBdr/>
@@ -6833,9 +6828,9 @@
       </w:tcPr>
     </w:tblStylePr>
   </w:style>
-  <w:style w:type="table" w:styleId="755">
+  <w:style w:type="table" w:styleId="792">
     <w:name w:val="Grid Table 3 - Accent 2"/>
-    <w:basedOn w:val="731"/>
+    <w:basedOn w:val="768"/>
     <w:uiPriority w:val="99"/>
     <w:pPr>
       <w:pBdr/>
@@ -7069,9 +7064,9 @@
       </w:tcPr>
     </w:tblStylePr>
   </w:style>
-  <w:style w:type="table" w:styleId="756">
+  <w:style w:type="table" w:styleId="793">
     <w:name w:val="Grid Table 3 - Accent 3"/>
-    <w:basedOn w:val="731"/>
+    <w:basedOn w:val="768"/>
     <w:uiPriority w:val="99"/>
     <w:pPr>
       <w:pBdr/>
@@ -7305,9 +7300,9 @@
       </w:tcPr>
     </w:tblStylePr>
   </w:style>
-  <w:style w:type="table" w:styleId="757">
+  <w:style w:type="table" w:styleId="794">
     <w:name w:val="Grid Table 3 - Accent 4"/>
-    <w:basedOn w:val="731"/>
+    <w:basedOn w:val="768"/>
     <w:uiPriority w:val="99"/>
     <w:pPr>
       <w:pBdr/>
@@ -7541,9 +7536,9 @@
       </w:tcPr>
     </w:tblStylePr>
   </w:style>
-  <w:style w:type="table" w:styleId="758">
+  <w:style w:type="table" w:styleId="795">
     <w:name w:val="Grid Table 3 - Accent 5"/>
-    <w:basedOn w:val="731"/>
+    <w:basedOn w:val="768"/>
     <w:uiPriority w:val="99"/>
     <w:pPr>
       <w:pBdr/>
@@ -7777,9 +7772,9 @@
       </w:tcPr>
     </w:tblStylePr>
   </w:style>
-  <w:style w:type="table" w:styleId="759">
+  <w:style w:type="table" w:styleId="796">
     <w:name w:val="Grid Table 3 - Accent 6"/>
-    <w:basedOn w:val="731"/>
+    <w:basedOn w:val="768"/>
     <w:uiPriority w:val="99"/>
     <w:pPr>
       <w:pBdr/>
@@ -8013,9 +8008,9 @@
       </w:tcPr>
     </w:tblStylePr>
   </w:style>
-  <w:style w:type="table" w:styleId="760">
+  <w:style w:type="table" w:styleId="797">
     <w:name w:val="Grid Table 4"/>
-    <w:basedOn w:val="731"/>
+    <w:basedOn w:val="768"/>
     <w:uiPriority w:val="59"/>
     <w:pPr>
       <w:pBdr/>
@@ -8236,9 +8231,9 @@
       </w:tcPr>
     </w:tblStylePr>
   </w:style>
-  <w:style w:type="table" w:styleId="761">
+  <w:style w:type="table" w:styleId="798">
     <w:name w:val="Grid Table 4 - Accent 1"/>
-    <w:basedOn w:val="731"/>
+    <w:basedOn w:val="768"/>
     <w:uiPriority w:val="59"/>
     <w:pPr>
       <w:pBdr/>
@@ -8459,9 +8454,9 @@
       </w:tcPr>
     </w:tblStylePr>
   </w:style>
-  <w:style w:type="table" w:styleId="762">
+  <w:style w:type="table" w:styleId="799">
     <w:name w:val="Grid Table 4 - Accent 2"/>
-    <w:basedOn w:val="731"/>
+    <w:basedOn w:val="768"/>
     <w:uiPriority w:val="59"/>
     <w:pPr>
       <w:pBdr/>
@@ -8682,9 +8677,9 @@
       </w:tcPr>
     </w:tblStylePr>
   </w:style>
-  <w:style w:type="table" w:styleId="763">
+  <w:style w:type="table" w:styleId="800">
     <w:name w:val="Grid Table 4 - Accent 3"/>
-    <w:basedOn w:val="731"/>
+    <w:basedOn w:val="768"/>
     <w:uiPriority w:val="59"/>
     <w:pPr>
       <w:pBdr/>
@@ -8905,9 +8900,9 @@
       </w:tcPr>
     </w:tblStylePr>
   </w:style>
-  <w:style w:type="table" w:styleId="764">
+  <w:style w:type="table" w:styleId="801">
     <w:name w:val="Grid Table 4 - Accent 4"/>
-    <w:basedOn w:val="731"/>
+    <w:basedOn w:val="768"/>
     <w:uiPriority w:val="59"/>
     <w:pPr>
       <w:pBdr/>
@@ -9128,9 +9123,9 @@
       </w:tcPr>
     </w:tblStylePr>
   </w:style>
-  <w:style w:type="table" w:styleId="765">
+  <w:style w:type="table" w:styleId="802">
     <w:name w:val="Grid Table 4 - Accent 5"/>
-    <w:basedOn w:val="731"/>
+    <w:basedOn w:val="768"/>
     <w:uiPriority w:val="59"/>
     <w:pPr>
       <w:pBdr/>
@@ -9351,9 +9346,9 @@
       </w:tcPr>
     </w:tblStylePr>
   </w:style>
-  <w:style w:type="table" w:styleId="766">
+  <w:style w:type="table" w:styleId="803">
     <w:name w:val="Grid Table 4 - Accent 6"/>
-    <w:basedOn w:val="731"/>
+    <w:basedOn w:val="768"/>
     <w:uiPriority w:val="59"/>
     <w:pPr>
       <w:pBdr/>
@@ -9574,9 +9569,9 @@
       </w:tcPr>
     </w:tblStylePr>
   </w:style>
-  <w:style w:type="table" w:styleId="767">
+  <w:style w:type="table" w:styleId="804">
     <w:name w:val="Grid Table 5 Dark"/>
-    <w:basedOn w:val="731"/>
+    <w:basedOn w:val="768"/>
     <w:uiPriority w:val="99"/>
     <w:pPr>
       <w:pBdr/>
@@ -9792,9 +9787,9 @@
       </w:tcPr>
     </w:tblStylePr>
   </w:style>
-  <w:style w:type="table" w:styleId="768">
+  <w:style w:type="table" w:styleId="805">
     <w:name w:val="Grid Table 5 Dark- Accent 1"/>
-    <w:basedOn w:val="731"/>
+    <w:basedOn w:val="768"/>
     <w:uiPriority w:val="99"/>
     <w:pPr>
       <w:pBdr/>
@@ -10010,9 +10005,9 @@
       </w:tcPr>
     </w:tblStylePr>
   </w:style>
-  <w:style w:type="table" w:styleId="769">
+  <w:style w:type="table" w:styleId="806">
     <w:name w:val="Grid Table 5 Dark - Accent 2"/>
-    <w:basedOn w:val="731"/>
+    <w:basedOn w:val="768"/>
     <w:uiPriority w:val="99"/>
     <w:pPr>
       <w:pBdr/>
@@ -10228,9 +10223,9 @@
       </w:tcPr>
     </w:tblStylePr>
   </w:style>
-  <w:style w:type="table" w:styleId="770">
+  <w:style w:type="table" w:styleId="807">
     <w:name w:val="Grid Table 5 Dark - Accent 3"/>
-    <w:basedOn w:val="731"/>
+    <w:basedOn w:val="768"/>
     <w:uiPriority w:val="99"/>
     <w:pPr>
       <w:pBdr/>
@@ -10446,9 +10441,9 @@
       </w:tcPr>
     </w:tblStylePr>
   </w:style>
-  <w:style w:type="table" w:styleId="771">
+  <w:style w:type="table" w:styleId="808">
     <w:name w:val="Grid Table 5 Dark- Accent 4"/>
-    <w:basedOn w:val="731"/>
+    <w:basedOn w:val="768"/>
     <w:uiPriority w:val="99"/>
     <w:pPr>
       <w:pBdr/>
@@ -10664,9 +10659,9 @@
       </w:tcPr>
     </w:tblStylePr>
   </w:style>
-  <w:style w:type="table" w:styleId="772">
+  <w:style w:type="table" w:styleId="809">
     <w:name w:val="Grid Table 5 Dark - Accent 5"/>
-    <w:basedOn w:val="731"/>
+    <w:basedOn w:val="768"/>
     <w:uiPriority w:val="99"/>
     <w:pPr>
       <w:pBdr/>
@@ -10882,9 +10877,9 @@
       </w:tcPr>
     </w:tblStylePr>
   </w:style>
-  <w:style w:type="table" w:styleId="773">
+  <w:style w:type="table" w:styleId="810">
     <w:name w:val="Grid Table 5 Dark - Accent 6"/>
-    <w:basedOn w:val="731"/>
+    <w:basedOn w:val="768"/>
     <w:uiPriority w:val="99"/>
     <w:pPr>
       <w:pBdr/>
@@ -11100,9 +11095,9 @@
       </w:tcPr>
     </w:tblStylePr>
   </w:style>
-  <w:style w:type="table" w:styleId="774">
+  <w:style w:type="table" w:styleId="811">
     <w:name w:val="Grid Table 6 Colorful"/>
-    <w:basedOn w:val="731"/>
+    <w:basedOn w:val="768"/>
     <w:uiPriority w:val="99"/>
     <w:pPr>
       <w:pBdr/>
@@ -11326,9 +11321,9 @@
       </w:tcPr>
     </w:tblStylePr>
   </w:style>
-  <w:style w:type="table" w:styleId="775">
+  <w:style w:type="table" w:styleId="812">
     <w:name w:val="Grid Table 6 Colorful - Accent 1"/>
-    <w:basedOn w:val="731"/>
+    <w:basedOn w:val="768"/>
     <w:uiPriority w:val="99"/>
     <w:pPr>
       <w:pBdr/>
@@ -11552,9 +11547,9 @@
       </w:tcPr>
     </w:tblStylePr>
   </w:style>
-  <w:style w:type="table" w:styleId="776">
+  <w:style w:type="table" w:styleId="813">
     <w:name w:val="Grid Table 6 Colorful - Accent 2"/>
-    <w:basedOn w:val="731"/>
+    <w:basedOn w:val="768"/>
     <w:uiPriority w:val="99"/>
     <w:pPr>
       <w:pBdr/>
@@ -11778,9 +11773,9 @@
       </w:tcPr>
     </w:tblStylePr>
   </w:style>
-  <w:style w:type="table" w:styleId="777">
+  <w:style w:type="table" w:styleId="814">
     <w:name w:val="Grid Table 6 Colorful - Accent 3"/>
-    <w:basedOn w:val="731"/>
+    <w:basedOn w:val="768"/>
     <w:uiPriority w:val="99"/>
     <w:pPr>
       <w:pBdr/>
@@ -12004,9 +11999,9 @@
       </w:tcPr>
     </w:tblStylePr>
   </w:style>
-  <w:style w:type="table" w:styleId="778">
+  <w:style w:type="table" w:styleId="815">
     <w:name w:val="Grid Table 6 Colorful - Accent 4"/>
-    <w:basedOn w:val="731"/>
+    <w:basedOn w:val="768"/>
     <w:uiPriority w:val="99"/>
     <w:pPr>
       <w:pBdr/>
@@ -12230,9 +12225,9 @@
       </w:tcPr>
     </w:tblStylePr>
   </w:style>
-  <w:style w:type="table" w:styleId="779">
+  <w:style w:type="table" w:styleId="816">
     <w:name w:val="Grid Table 6 Colorful - Accent 5"/>
-    <w:basedOn w:val="731"/>
+    <w:basedOn w:val="768"/>
     <w:uiPriority w:val="99"/>
     <w:pPr>
       <w:pBdr/>
@@ -12456,9 +12451,9 @@
       </w:tcPr>
     </w:tblStylePr>
   </w:style>
-  <w:style w:type="table" w:styleId="780">
+  <w:style w:type="table" w:styleId="817">
     <w:name w:val="Grid Table 6 Colorful - Accent 6"/>
-    <w:basedOn w:val="731"/>
+    <w:basedOn w:val="768"/>
     <w:uiPriority w:val="99"/>
     <w:pPr>
       <w:pBdr/>
@@ -12682,9 +12677,9 @@
       </w:tcPr>
     </w:tblStylePr>
   </w:style>
-  <w:style w:type="table" w:styleId="781">
+  <w:style w:type="table" w:styleId="818">
     <w:name w:val="Grid Table 7 Colorful"/>
-    <w:basedOn w:val="731"/>
+    <w:basedOn w:val="768"/>
     <w:uiPriority w:val="99"/>
     <w:pPr>
       <w:pBdr/>
@@ -12929,9 +12924,9 @@
       </w:tcPr>
     </w:tblStylePr>
   </w:style>
-  <w:style w:type="table" w:styleId="782">
+  <w:style w:type="table" w:styleId="819">
     <w:name w:val="Grid Table 7 Colorful - Accent 1"/>
-    <w:basedOn w:val="731"/>
+    <w:basedOn w:val="768"/>
     <w:uiPriority w:val="99"/>
     <w:pPr>
       <w:pBdr/>
@@ -13176,9 +13171,9 @@
       </w:tcPr>
     </w:tblStylePr>
   </w:style>
-  <w:style w:type="table" w:styleId="783">
+  <w:style w:type="table" w:styleId="820">
     <w:name w:val="Grid Table 7 Colorful - Accent 2"/>
-    <w:basedOn w:val="731"/>
+    <w:basedOn w:val="768"/>
     <w:uiPriority w:val="99"/>
     <w:pPr>
       <w:pBdr/>
@@ -13423,9 +13418,9 @@
       </w:tcPr>
     </w:tblStylePr>
   </w:style>
-  <w:style w:type="table" w:styleId="784">
+  <w:style w:type="table" w:styleId="821">
     <w:name w:val="Grid Table 7 Colorful - Accent 3"/>
-    <w:basedOn w:val="731"/>
+    <w:basedOn w:val="768"/>
     <w:uiPriority w:val="99"/>
     <w:pPr>
       <w:pBdr/>
@@ -13670,9 +13665,9 @@
       </w:tcPr>
     </w:tblStylePr>
   </w:style>
-  <w:style w:type="table" w:styleId="785">
+  <w:style w:type="table" w:styleId="822">
     <w:name w:val="Grid Table 7 Colorful - Accent 4"/>
-    <w:basedOn w:val="731"/>
+    <w:basedOn w:val="768"/>
     <w:uiPriority w:val="99"/>
     <w:pPr>
       <w:pBdr/>
@@ -13917,9 +13912,9 @@
       </w:tcPr>
     </w:tblStylePr>
   </w:style>
-  <w:style w:type="table" w:styleId="786">
+  <w:style w:type="table" w:styleId="823">
     <w:name w:val="Grid Table 7 Colorful - Accent 5"/>
-    <w:basedOn w:val="731"/>
+    <w:basedOn w:val="768"/>
     <w:uiPriority w:val="99"/>
     <w:pPr>
       <w:pBdr/>
@@ -14164,9 +14159,9 @@
       </w:tcPr>
     </w:tblStylePr>
   </w:style>
-  <w:style w:type="table" w:styleId="787">
+  <w:style w:type="table" w:styleId="824">
     <w:name w:val="Grid Table 7 Colorful - Accent 6"/>
-    <w:basedOn w:val="731"/>
+    <w:basedOn w:val="768"/>
     <w:uiPriority w:val="99"/>
     <w:pPr>
       <w:pBdr/>
@@ -14411,9 +14406,9 @@
       </w:tcPr>
     </w:tblStylePr>
   </w:style>
-  <w:style w:type="table" w:styleId="788">
+  <w:style w:type="table" w:styleId="825">
     <w:name w:val="List Table 1 Light"/>
-    <w:basedOn w:val="731"/>
+    <w:basedOn w:val="768"/>
     <w:uiPriority w:val="99"/>
     <w:pPr>
       <w:pBdr/>
@@ -14622,9 +14617,9 @@
       </w:tcPr>
     </w:tblStylePr>
   </w:style>
-  <w:style w:type="table" w:styleId="789">
+  <w:style w:type="table" w:styleId="826">
     <w:name w:val="List Table 1 Light - Accent 1"/>
-    <w:basedOn w:val="731"/>
+    <w:basedOn w:val="768"/>
     <w:uiPriority w:val="99"/>
     <w:pPr>
       <w:pBdr/>
@@ -14833,9 +14828,9 @@
       </w:tcPr>
     </w:tblStylePr>
   </w:style>
-  <w:style w:type="table" w:styleId="790">
+  <w:style w:type="table" w:styleId="827">
     <w:name w:val="List Table 1 Light - Accent 2"/>
-    <w:basedOn w:val="731"/>
+    <w:basedOn w:val="768"/>
     <w:uiPriority w:val="99"/>
     <w:pPr>
       <w:pBdr/>
@@ -15044,9 +15039,9 @@
       </w:tcPr>
     </w:tblStylePr>
   </w:style>
-  <w:style w:type="table" w:styleId="791">
+  <w:style w:type="table" w:styleId="828">
     <w:name w:val="List Table 1 Light - Accent 3"/>
-    <w:basedOn w:val="731"/>
+    <w:basedOn w:val="768"/>
     <w:uiPriority w:val="99"/>
     <w:pPr>
       <w:pBdr/>
@@ -15255,9 +15250,9 @@
       </w:tcPr>
     </w:tblStylePr>
   </w:style>
-  <w:style w:type="table" w:styleId="792">
+  <w:style w:type="table" w:styleId="829">
     <w:name w:val="List Table 1 Light - Accent 4"/>
-    <w:basedOn w:val="731"/>
+    <w:basedOn w:val="768"/>
     <w:uiPriority w:val="99"/>
     <w:pPr>
       <w:pBdr/>
@@ -15466,9 +15461,9 @@
       </w:tcPr>
     </w:tblStylePr>
   </w:style>
-  <w:style w:type="table" w:styleId="793">
+  <w:style w:type="table" w:styleId="830">
     <w:name w:val="List Table 1 Light - Accent 5"/>
-    <w:basedOn w:val="731"/>
+    <w:basedOn w:val="768"/>
     <w:uiPriority w:val="99"/>
     <w:pPr>
       <w:pBdr/>
@@ -15677,9 +15672,9 @@
       </w:tcPr>
     </w:tblStylePr>
   </w:style>
-  <w:style w:type="table" w:styleId="794">
+  <w:style w:type="table" w:styleId="831">
     <w:name w:val="List Table 1 Light - Accent 6"/>
-    <w:basedOn w:val="731"/>
+    <w:basedOn w:val="768"/>
     <w:uiPriority w:val="99"/>
     <w:pPr>
       <w:pBdr/>
@@ -15888,9 +15883,9 @@
       </w:tcPr>
     </w:tblStylePr>
   </w:style>
-  <w:style w:type="table" w:styleId="795">
+  <w:style w:type="table" w:styleId="832">
     <w:name w:val="List Table 2"/>
-    <w:basedOn w:val="731"/>
+    <w:basedOn w:val="768"/>
     <w:uiPriority w:val="99"/>
     <w:pPr>
       <w:pBdr/>
@@ -16113,9 +16108,9 @@
       </w:tcPr>
     </w:tblStylePr>
   </w:style>
-  <w:style w:type="table" w:styleId="796">
+  <w:style w:type="table" w:styleId="833">
     <w:name w:val="List Table 2 - Accent 1"/>
-    <w:basedOn w:val="731"/>
+    <w:basedOn w:val="768"/>
     <w:uiPriority w:val="99"/>
     <w:pPr>
       <w:pBdr/>
@@ -16338,9 +16333,9 @@
       </w:tcPr>
     </w:tblStylePr>
   </w:style>
-  <w:style w:type="table" w:styleId="797">
+  <w:style w:type="table" w:styleId="834">
     <w:name w:val="List Table 2 - Accent 2"/>
-    <w:basedOn w:val="731"/>
+    <w:basedOn w:val="768"/>
     <w:uiPriority w:val="99"/>
     <w:pPr>
       <w:pBdr/>
@@ -16563,9 +16558,9 @@
       </w:tcPr>
     </w:tblStylePr>
   </w:style>
-  <w:style w:type="table" w:styleId="798">
+  <w:style w:type="table" w:styleId="835">
     <w:name w:val="List Table 2 - Accent 3"/>
-    <w:basedOn w:val="731"/>
+    <w:basedOn w:val="768"/>
     <w:uiPriority w:val="99"/>
     <w:pPr>
       <w:pBdr/>
@@ -16788,9 +16783,9 @@
       </w:tcPr>
     </w:tblStylePr>
   </w:style>
-  <w:style w:type="table" w:styleId="799">
+  <w:style w:type="table" w:styleId="836">
     <w:name w:val="List Table 2 - Accent 4"/>
-    <w:basedOn w:val="731"/>
+    <w:basedOn w:val="768"/>
     <w:uiPriority w:val="99"/>
     <w:pPr>
       <w:pBdr/>
@@ -17013,9 +17008,9 @@
       </w:tcPr>
     </w:tblStylePr>
   </w:style>
-  <w:style w:type="table" w:styleId="800">
+  <w:style w:type="table" w:styleId="837">
     <w:name w:val="List Table 2 - Accent 5"/>
-    <w:basedOn w:val="731"/>
+    <w:basedOn w:val="768"/>
     <w:uiPriority w:val="99"/>
     <w:pPr>
       <w:pBdr/>
@@ -17238,9 +17233,9 @@
       </w:tcPr>
     </w:tblStylePr>
   </w:style>
-  <w:style w:type="table" w:styleId="801">
+  <w:style w:type="table" w:styleId="838">
     <w:name w:val="List Table 2 - Accent 6"/>
-    <w:basedOn w:val="731"/>
+    <w:basedOn w:val="768"/>
     <w:uiPriority w:val="99"/>
     <w:pPr>
       <w:pBdr/>
@@ -17463,9 +17458,9 @@
       </w:tcPr>
     </w:tblStylePr>
   </w:style>
-  <w:style w:type="table" w:styleId="802">
+  <w:style w:type="table" w:styleId="839">
     <w:name w:val="List Table 3"/>
-    <w:basedOn w:val="731"/>
+    <w:basedOn w:val="768"/>
     <w:uiPriority w:val="99"/>
     <w:pPr>
       <w:pBdr/>
@@ -17681,9 +17676,9 @@
       </w:tcPr>
     </w:tblStylePr>
   </w:style>
-  <w:style w:type="table" w:styleId="803">
+  <w:style w:type="table" w:styleId="840">
     <w:name w:val="List Table 3 - Accent 1"/>
-    <w:basedOn w:val="731"/>
+    <w:basedOn w:val="768"/>
     <w:uiPriority w:val="99"/>
     <w:pPr>
       <w:pBdr/>
@@ -17899,9 +17894,9 @@
       </w:tcPr>
     </w:tblStylePr>
   </w:style>
-  <w:style w:type="table" w:styleId="804">
+  <w:style w:type="table" w:styleId="841">
     <w:name w:val="List Table 3 - Accent 2"/>
-    <w:basedOn w:val="731"/>
+    <w:basedOn w:val="768"/>
     <w:uiPriority w:val="99"/>
     <w:pPr>
       <w:pBdr/>
@@ -18117,9 +18112,9 @@
       </w:tcPr>
     </w:tblStylePr>
   </w:style>
-  <w:style w:type="table" w:styleId="805">
+  <w:style w:type="table" w:styleId="842">
     <w:name w:val="List Table 3 - Accent 3"/>
-    <w:basedOn w:val="731"/>
+    <w:basedOn w:val="768"/>
     <w:uiPriority w:val="99"/>
     <w:pPr>
       <w:pBdr/>
@@ -18335,9 +18330,9 @@
       </w:tcPr>
     </w:tblStylePr>
   </w:style>
-  <w:style w:type="table" w:styleId="806">
+  <w:style w:type="table" w:styleId="843">
     <w:name w:val="List Table 3 - Accent 4"/>
-    <w:basedOn w:val="731"/>
+    <w:basedOn w:val="768"/>
     <w:uiPriority w:val="99"/>
     <w:pPr>
       <w:pBdr/>
@@ -18553,9 +18548,9 @@
       </w:tcPr>
     </w:tblStylePr>
   </w:style>
-  <w:style w:type="table" w:styleId="807">
+  <w:style w:type="table" w:styleId="844">
     <w:name w:val="List Table 3 - Accent 5"/>
-    <w:basedOn w:val="731"/>
+    <w:basedOn w:val="768"/>
     <w:uiPriority w:val="99"/>
     <w:pPr>
       <w:pBdr/>
@@ -18771,9 +18766,9 @@
       </w:tcPr>
     </w:tblStylePr>
   </w:style>
-  <w:style w:type="table" w:styleId="808">
+  <w:style w:type="table" w:styleId="845">
     <w:name w:val="List Table 3 - Accent 6"/>
-    <w:basedOn w:val="731"/>
+    <w:basedOn w:val="768"/>
     <w:uiPriority w:val="99"/>
     <w:pPr>
       <w:pBdr/>
@@ -18989,9 +18984,9 @@
       </w:tcPr>
     </w:tblStylePr>
   </w:style>
-  <w:style w:type="table" w:styleId="809">
+  <w:style w:type="table" w:styleId="846">
     <w:name w:val="List Table 4"/>
-    <w:basedOn w:val="731"/>
+    <w:basedOn w:val="768"/>
     <w:uiPriority w:val="99"/>
     <w:pPr>
       <w:pBdr/>
@@ -19204,9 +19199,9 @@
       </w:tcPr>
     </w:tblStylePr>
   </w:style>
-  <w:style w:type="table" w:styleId="810">
+  <w:style w:type="table" w:styleId="847">
     <w:name w:val="List Table 4 - Accent 1"/>
-    <w:basedOn w:val="731"/>
+    <w:basedOn w:val="768"/>
     <w:uiPriority w:val="99"/>
     <w:pPr>
       <w:pBdr/>
@@ -19419,9 +19414,9 @@
       </w:tcPr>
     </w:tblStylePr>
   </w:style>
-  <w:style w:type="table" w:styleId="811">
+  <w:style w:type="table" w:styleId="848">
     <w:name w:val="List Table 4 - Accent 2"/>
-    <w:basedOn w:val="731"/>
+    <w:basedOn w:val="768"/>
     <w:uiPriority w:val="99"/>
     <w:pPr>
       <w:pBdr/>
@@ -19634,9 +19629,9 @@
       </w:tcPr>
     </w:tblStylePr>
   </w:style>
-  <w:style w:type="table" w:styleId="812">
+  <w:style w:type="table" w:styleId="849">
     <w:name w:val="List Table 4 - Accent 3"/>
-    <w:basedOn w:val="731"/>
+    <w:basedOn w:val="768"/>
     <w:uiPriority w:val="99"/>
     <w:pPr>
       <w:pBdr/>
@@ -19849,9 +19844,9 @@
       </w:tcPr>
     </w:tblStylePr>
   </w:style>
-  <w:style w:type="table" w:styleId="813">
+  <w:style w:type="table" w:styleId="850">
     <w:name w:val="List Table 4 - Accent 4"/>
-    <w:basedOn w:val="731"/>
+    <w:basedOn w:val="768"/>
     <w:uiPriority w:val="99"/>
     <w:pPr>
       <w:pBdr/>
@@ -20064,9 +20059,9 @@
       </w:tcPr>
     </w:tblStylePr>
   </w:style>
-  <w:style w:type="table" w:styleId="814">
+  <w:style w:type="table" w:styleId="851">
     <w:name w:val="List Table 4 - Accent 5"/>
-    <w:basedOn w:val="731"/>
+    <w:basedOn w:val="768"/>
     <w:uiPriority w:val="99"/>
     <w:pPr>
       <w:pBdr/>
@@ -20279,9 +20274,9 @@
       </w:tcPr>
     </w:tblStylePr>
   </w:style>
-  <w:style w:type="table" w:styleId="815">
+  <w:style w:type="table" w:styleId="852">
     <w:name w:val="List Table 4 - Accent 6"/>
-    <w:basedOn w:val="731"/>
+    <w:basedOn w:val="768"/>
     <w:uiPriority w:val="99"/>
     <w:pPr>
       <w:pBdr/>
@@ -20494,9 +20489,9 @@
       </w:tcPr>
     </w:tblStylePr>
   </w:style>
-  <w:style w:type="table" w:styleId="816">
+  <w:style w:type="table" w:styleId="853">
     <w:name w:val="List Table 5 Dark"/>
-    <w:basedOn w:val="731"/>
+    <w:basedOn w:val="768"/>
     <w:uiPriority w:val="99"/>
     <w:pPr>
       <w:pBdr/>
@@ -20730,9 +20725,9 @@
       </w:tcPr>
     </w:tblStylePr>
   </w:style>
-  <w:style w:type="table" w:styleId="817">
+  <w:style w:type="table" w:styleId="854">
     <w:name w:val="List Table 5 Dark - Accent 1"/>
-    <w:basedOn w:val="731"/>
+    <w:basedOn w:val="768"/>
     <w:uiPriority w:val="99"/>
     <w:pPr>
       <w:pBdr/>
@@ -20966,9 +20961,9 @@
       </w:tcPr>
     </w:tblStylePr>
   </w:style>
-  <w:style w:type="table" w:styleId="818">
+  <w:style w:type="table" w:styleId="855">
     <w:name w:val="List Table 5 Dark - Accent 2"/>
-    <w:basedOn w:val="731"/>
+    <w:basedOn w:val="768"/>
     <w:uiPriority w:val="99"/>
     <w:pPr>
       <w:pBdr/>
@@ -21202,9 +21197,9 @@
       </w:tcPr>
     </w:tblStylePr>
   </w:style>
-  <w:style w:type="table" w:styleId="819">
+  <w:style w:type="table" w:styleId="856">
     <w:name w:val="List Table 5 Dark - Accent 3"/>
-    <w:basedOn w:val="731"/>
+    <w:basedOn w:val="768"/>
     <w:uiPriority w:val="99"/>
     <w:pPr>
       <w:pBdr/>
@@ -21438,9 +21433,9 @@
       </w:tcPr>
     </w:tblStylePr>
   </w:style>
-  <w:style w:type="table" w:styleId="820">
+  <w:style w:type="table" w:styleId="857">
     <w:name w:val="List Table 5 Dark - Accent 4"/>
-    <w:basedOn w:val="731"/>
+    <w:basedOn w:val="768"/>
     <w:uiPriority w:val="99"/>
     <w:pPr>
       <w:pBdr/>
@@ -21674,9 +21669,9 @@
       </w:tcPr>
     </w:tblStylePr>
   </w:style>
-  <w:style w:type="table" w:styleId="821">
+  <w:style w:type="table" w:styleId="858">
     <w:name w:val="List Table 5 Dark - Accent 5"/>
-    <w:basedOn w:val="731"/>
+    <w:basedOn w:val="768"/>
     <w:uiPriority w:val="99"/>
     <w:pPr>
       <w:pBdr/>
@@ -21910,9 +21905,9 @@
       </w:tcPr>
     </w:tblStylePr>
   </w:style>
-  <w:style w:type="table" w:styleId="822">
+  <w:style w:type="table" w:styleId="859">
     <w:name w:val="List Table 5 Dark - Accent 6"/>
-    <w:basedOn w:val="731"/>
+    <w:basedOn w:val="768"/>
     <w:uiPriority w:val="99"/>
     <w:pPr>
       <w:pBdr/>
@@ -22146,9 +22141,9 @@
       </w:tcPr>
     </w:tblStylePr>
   </w:style>
-  <w:style w:type="table" w:styleId="823">
+  <w:style w:type="table" w:styleId="860">
     <w:name w:val="List Table 6 Colorful"/>
-    <w:basedOn w:val="731"/>
+    <w:basedOn w:val="768"/>
     <w:uiPriority w:val="99"/>
     <w:pPr>
       <w:pBdr/>
@@ -22366,9 +22361,9 @@
       </w:tcPr>
     </w:tblStylePr>
   </w:style>
-  <w:style w:type="table" w:styleId="824">
+  <w:style w:type="table" w:styleId="861">
     <w:name w:val="List Table 6 Colorful - Accent 1"/>
-    <w:basedOn w:val="731"/>
+    <w:basedOn w:val="768"/>
     <w:uiPriority w:val="99"/>
     <w:pPr>
       <w:pBdr/>
@@ -22586,9 +22581,9 @@
       </w:tcPr>
     </w:tblStylePr>
   </w:style>
-  <w:style w:type="table" w:styleId="825">
+  <w:style w:type="table" w:styleId="862">
     <w:name w:val="List Table 6 Colorful - Accent 2"/>
-    <w:basedOn w:val="731"/>
+    <w:basedOn w:val="768"/>
     <w:uiPriority w:val="99"/>
     <w:pPr>
       <w:pBdr/>
@@ -22806,9 +22801,9 @@
       </w:tcPr>
     </w:tblStylePr>
   </w:style>
-  <w:style w:type="table" w:styleId="826">
+  <w:style w:type="table" w:styleId="863">
     <w:name w:val="List Table 6 Colorful - Accent 3"/>
-    <w:basedOn w:val="731"/>
+    <w:basedOn w:val="768"/>
     <w:uiPriority w:val="99"/>
     <w:pPr>
       <w:pBdr/>
@@ -23026,9 +23021,9 @@
       </w:tcPr>
     </w:tblStylePr>
   </w:style>
-  <w:style w:type="table" w:styleId="827">
+  <w:style w:type="table" w:styleId="864">
     <w:name w:val="List Table 6 Colorful - Accent 4"/>
-    <w:basedOn w:val="731"/>
+    <w:basedOn w:val="768"/>
     <w:uiPriority w:val="99"/>
     <w:pPr>
       <w:pBdr/>
@@ -23246,9 +23241,9 @@
       </w:tcPr>
     </w:tblStylePr>
   </w:style>
-  <w:style w:type="table" w:styleId="828">
+  <w:style w:type="table" w:styleId="865">
     <w:name w:val="List Table 6 Colorful - Accent 5"/>
-    <w:basedOn w:val="731"/>
+    <w:basedOn w:val="768"/>
     <w:uiPriority w:val="99"/>
     <w:pPr>
       <w:pBdr/>
@@ -23466,9 +23461,9 @@
       </w:tcPr>
     </w:tblStylePr>
   </w:style>
-  <w:style w:type="table" w:styleId="829">
+  <w:style w:type="table" w:styleId="866">
     <w:name w:val="List Table 6 Colorful - Accent 6"/>
-    <w:basedOn w:val="731"/>
+    <w:basedOn w:val="768"/>
     <w:uiPriority w:val="99"/>
     <w:pPr>
       <w:pBdr/>
@@ -23686,9 +23681,9 @@
       </w:tcPr>
     </w:tblStylePr>
   </w:style>
-  <w:style w:type="table" w:styleId="830">
+  <w:style w:type="table" w:styleId="867">
     <w:name w:val="List Table 7 Colorful"/>
-    <w:basedOn w:val="731"/>
+    <w:basedOn w:val="768"/>
     <w:uiPriority w:val="99"/>
     <w:pPr>
       <w:pBdr/>
@@ -23934,9 +23929,9 @@
       </w:tcPr>
     </w:tblStylePr>
   </w:style>
-  <w:style w:type="table" w:styleId="831">
+  <w:style w:type="table" w:styleId="868">
     <w:name w:val="List Table 7 Colorful - Accent 1"/>
-    <w:basedOn w:val="731"/>
+    <w:basedOn w:val="768"/>
     <w:uiPriority w:val="99"/>
     <w:pPr>
       <w:pBdr/>
@@ -24182,9 +24177,9 @@
       </w:tcPr>
     </w:tblStylePr>
   </w:style>
-  <w:style w:type="table" w:styleId="832">
+  <w:style w:type="table" w:styleId="869">
     <w:name w:val="List Table 7 Colorful - Accent 2"/>
-    <w:basedOn w:val="731"/>
+    <w:basedOn w:val="768"/>
     <w:uiPriority w:val="99"/>
     <w:pPr>
       <w:pBdr/>
@@ -24430,9 +24425,9 @@
       </w:tcPr>
     </w:tblStylePr>
   </w:style>
-  <w:style w:type="table" w:styleId="833">
+  <w:style w:type="table" w:styleId="870">
     <w:name w:val="List Table 7 Colorful - Accent 3"/>
-    <w:basedOn w:val="731"/>
+    <w:basedOn w:val="768"/>
     <w:uiPriority w:val="99"/>
     <w:pPr>
       <w:pBdr/>
@@ -24678,9 +24673,9 @@
       </w:tcPr>
     </w:tblStylePr>
   </w:style>
-  <w:style w:type="table" w:styleId="834">
+  <w:style w:type="table" w:styleId="871">
     <w:name w:val="List Table 7 Colorful - Accent 4"/>
-    <w:basedOn w:val="731"/>
+    <w:basedOn w:val="768"/>
     <w:uiPriority w:val="99"/>
     <w:pPr>
       <w:pBdr/>
@@ -24926,9 +24921,9 @@
       </w:tcPr>
     </w:tblStylePr>
   </w:style>
-  <w:style w:type="table" w:styleId="835">
+  <w:style w:type="table" w:styleId="872">
     <w:name w:val="List Table 7 Colorful - Accent 5"/>
-    <w:basedOn w:val="731"/>
+    <w:basedOn w:val="768"/>
     <w:uiPriority w:val="99"/>
     <w:pPr>
       <w:pBdr/>
@@ -25174,9 +25169,9 @@
       </w:tcPr>
     </w:tblStylePr>
   </w:style>
-  <w:style w:type="table" w:styleId="836">
+  <w:style w:type="table" w:styleId="873">
     <w:name w:val="List Table 7 Colorful - Accent 6"/>
-    <w:basedOn w:val="731"/>
+    <w:basedOn w:val="768"/>
     <w:uiPriority w:val="99"/>
     <w:pPr>
       <w:pBdr/>
@@ -25422,9 +25417,9 @@
       </w:tcPr>
     </w:tblStylePr>
   </w:style>
-  <w:style w:type="table" w:styleId="837">
+  <w:style w:type="table" w:styleId="874">
     <w:name w:val="Lined - Accent"/>
-    <w:basedOn w:val="731"/>
+    <w:basedOn w:val="768"/>
     <w:uiPriority w:val="99"/>
     <w:pPr>
       <w:pBdr/>
@@ -25639,9 +25634,9 @@
       </w:tcPr>
     </w:tblStylePr>
   </w:style>
-  <w:style w:type="table" w:styleId="838">
+  <w:style w:type="table" w:styleId="875">
     <w:name w:val="Lined - Accent 1"/>
-    <w:basedOn w:val="731"/>
+    <w:basedOn w:val="768"/>
     <w:uiPriority w:val="99"/>
     <w:pPr>
       <w:pBdr/>
@@ -25856,9 +25851,9 @@
       </w:tcPr>
     </w:tblStylePr>
   </w:style>
-  <w:style w:type="table" w:styleId="839">
+  <w:style w:type="table" w:styleId="876">
     <w:name w:val="Lined - Accent 2"/>
-    <w:basedOn w:val="731"/>
+    <w:basedOn w:val="768"/>
     <w:uiPriority w:val="99"/>
     <w:pPr>
       <w:pBdr/>
@@ -26073,9 +26068,9 @@
       </w:tcPr>
     </w:tblStylePr>
   </w:style>
-  <w:style w:type="table" w:styleId="840">
+  <w:style w:type="table" w:styleId="877">
     <w:name w:val="Lined - Accent 3"/>
-    <w:basedOn w:val="731"/>
+    <w:basedOn w:val="768"/>
     <w:uiPriority w:val="99"/>
     <w:pPr>
       <w:pBdr/>
@@ -26290,9 +26285,9 @@
       </w:tcPr>
     </w:tblStylePr>
   </w:style>
-  <w:style w:type="table" w:styleId="841">
+  <w:style w:type="table" w:styleId="878">
     <w:name w:val="Lined - Accent 4"/>
-    <w:basedOn w:val="731"/>
+    <w:basedOn w:val="768"/>
     <w:uiPriority w:val="99"/>
     <w:pPr>
       <w:pBdr/>
@@ -26507,9 +26502,9 @@
       </w:tcPr>
     </w:tblStylePr>
   </w:style>
-  <w:style w:type="table" w:styleId="842">
+  <w:style w:type="table" w:styleId="879">
     <w:name w:val="Lined - Accent 5"/>
-    <w:basedOn w:val="731"/>
+    <w:basedOn w:val="768"/>
     <w:uiPriority w:val="99"/>
     <w:pPr>
       <w:pBdr/>
@@ -26724,9 +26719,9 @@
       </w:tcPr>
     </w:tblStylePr>
   </w:style>
-  <w:style w:type="table" w:styleId="843">
+  <w:style w:type="table" w:styleId="880">
     <w:name w:val="Lined - Accent 6"/>
-    <w:basedOn w:val="731"/>
+    <w:basedOn w:val="768"/>
     <w:uiPriority w:val="99"/>
     <w:pPr>
       <w:pBdr/>
@@ -26941,9 +26936,9 @@
       </w:tcPr>
     </w:tblStylePr>
   </w:style>
-  <w:style w:type="table" w:styleId="844">
+  <w:style w:type="table" w:styleId="881">
     <w:name w:val="Bordered &amp; Lined - Accent"/>
-    <w:basedOn w:val="731"/>
+    <w:basedOn w:val="768"/>
     <w:uiPriority w:val="99"/>
     <w:pPr>
       <w:pBdr/>
@@ -27165,9 +27160,9 @@
       </w:tcPr>
     </w:tblStylePr>
   </w:style>
-  <w:style w:type="table" w:styleId="845">
+  <w:style w:type="table" w:styleId="882">
     <w:name w:val="Bordered &amp; Lined - Accent 1"/>
-    <w:basedOn w:val="731"/>
+    <w:basedOn w:val="768"/>
     <w:uiPriority w:val="99"/>
     <w:pPr>
       <w:pBdr/>
@@ -27389,9 +27384,9 @@
       </w:tcPr>
     </w:tblStylePr>
   </w:style>
-  <w:style w:type="table" w:styleId="846">
+  <w:style w:type="table" w:styleId="883">
     <w:name w:val="Bordered &amp; Lined - Accent 2"/>
-    <w:basedOn w:val="731"/>
+    <w:basedOn w:val="768"/>
     <w:uiPriority w:val="99"/>
     <w:pPr>
       <w:pBdr/>
@@ -27613,9 +27608,9 @@
       </w:tcPr>
     </w:tblStylePr>
   </w:style>
-  <w:style w:type="table" w:styleId="847">
+  <w:style w:type="table" w:styleId="884">
     <w:name w:val="Bordered &amp; Lined - Accent 3"/>
-    <w:basedOn w:val="731"/>
+    <w:basedOn w:val="768"/>
     <w:uiPriority w:val="99"/>
     <w:pPr>
       <w:pBdr/>
@@ -27837,9 +27832,9 @@
       </w:tcPr>
     </w:tblStylePr>
   </w:style>
-  <w:style w:type="table" w:styleId="848">
+  <w:style w:type="table" w:styleId="885">
     <w:name w:val="Bordered &amp; Lined - Accent 4"/>
-    <w:basedOn w:val="731"/>
+    <w:basedOn w:val="768"/>
     <w:uiPriority w:val="99"/>
     <w:pPr>
       <w:pBdr/>
@@ -28061,9 +28056,9 @@
       </w:tcPr>
     </w:tblStylePr>
   </w:style>
-  <w:style w:type="table" w:styleId="849">
+  <w:style w:type="table" w:styleId="886">
     <w:name w:val="Bordered &amp; Lined - Accent 5"/>
-    <w:basedOn w:val="731"/>
+    <w:basedOn w:val="768"/>
     <w:uiPriority w:val="99"/>
     <w:pPr>
       <w:pBdr/>
@@ -28285,9 +28280,9 @@
       </w:tcPr>
     </w:tblStylePr>
   </w:style>
-  <w:style w:type="table" w:styleId="850">
+  <w:style w:type="table" w:styleId="887">
     <w:name w:val="Bordered &amp; Lined - Accent 6"/>
-    <w:basedOn w:val="731"/>
+    <w:basedOn w:val="768"/>
     <w:uiPriority w:val="99"/>
     <w:pPr>
       <w:pBdr/>
@@ -28509,9 +28504,9 @@
       </w:tcPr>
     </w:tblStylePr>
   </w:style>
-  <w:style w:type="table" w:styleId="851">
+  <w:style w:type="table" w:styleId="888">
     <w:name w:val="Bordered"/>
-    <w:basedOn w:val="731"/>
+    <w:basedOn w:val="768"/>
     <w:uiPriority w:val="99"/>
     <w:pPr>
       <w:pBdr/>
@@ -28729,9 +28724,9 @@
       </w:tcPr>
     </w:tblStylePr>
   </w:style>
-  <w:style w:type="table" w:styleId="852">
+  <w:style w:type="table" w:styleId="889">
     <w:name w:val="Bordered - Accent 1"/>
-    <w:basedOn w:val="731"/>
+    <w:basedOn w:val="768"/>
     <w:uiPriority w:val="99"/>
     <w:pPr>
       <w:pBdr/>
@@ -28949,9 +28944,9 @@
       </w:tcPr>
     </w:tblStylePr>
   </w:style>
-  <w:style w:type="table" w:styleId="853">
+  <w:style w:type="table" w:styleId="890">
     <w:name w:val="Bordered - Accent 2"/>
-    <w:basedOn w:val="731"/>
+    <w:basedOn w:val="768"/>
     <w:uiPriority w:val="99"/>
     <w:pPr>
       <w:pBdr/>
@@ -29169,9 +29164,9 @@
       </w:tcPr>
     </w:tblStylePr>
   </w:style>
-  <w:style w:type="table" w:styleId="854">
+  <w:style w:type="table" w:styleId="891">
     <w:name w:val="Bordered - Accent 3"/>
-    <w:basedOn w:val="731"/>
+    <w:basedOn w:val="768"/>
     <w:uiPriority w:val="99"/>
     <w:pPr>
       <w:pBdr/>
@@ -29389,9 +29384,9 @@
       </w:tcPr>
     </w:tblStylePr>
   </w:style>
-  <w:style w:type="table" w:styleId="855">
+  <w:style w:type="table" w:styleId="892">
     <w:name w:val="Bordered - Accent 4"/>
-    <w:basedOn w:val="731"/>
+    <w:basedOn w:val="768"/>
     <w:uiPriority w:val="99"/>
     <w:pPr>
       <w:pBdr/>
@@ -29609,9 +29604,9 @@
       </w:tcPr>
     </w:tblStylePr>
   </w:style>
-  <w:style w:type="table" w:styleId="856">
+  <w:style w:type="table" w:styleId="893">
     <w:name w:val="Bordered - Accent 5"/>
-    <w:basedOn w:val="731"/>
+    <w:basedOn w:val="768"/>
     <w:uiPriority w:val="99"/>
     <w:pPr>
       <w:pBdr/>
@@ -29829,9 +29824,9 @@
       </w:tcPr>
     </w:tblStylePr>
   </w:style>
-  <w:style w:type="table" w:styleId="857">
+  <w:style w:type="table" w:styleId="894">
     <w:name w:val="Bordered - Accent 6"/>
-    <w:basedOn w:val="731"/>
+    <w:basedOn w:val="768"/>
     <w:uiPriority w:val="99"/>
     <w:pPr>
       <w:pBdr/>

</xml_diff>